<commit_message>
fix(paper): resolve model attribution, audit empirical metrics, regenerate all deliverables and sync OIST text
</commit_message>
<xml_diff>
--- a/paper/research_paper.docx
+++ b/paper/research_paper.docx
@@ -2,13 +2,22 @@
 <file path=word/document.xml><?xml version="1.0" encoding="utf-8"?>
 <w:document xmlns:w="http://schemas.openxmlformats.org/wordprocessingml/2006/main" xmlns:m="http://schemas.openxmlformats.org/officeDocument/2006/math" xmlns:r="http://schemas.openxmlformats.org/officeDocument/2006/relationships" xmlns:o="urn:schemas-microsoft-com:office:office" xmlns:v="urn:schemas-microsoft-com:vml" xmlns:w10="urn:schemas-microsoft-com:office:word" xmlns:a="http://schemas.openxmlformats.org/drawingml/2006/main" xmlns:pic="http://schemas.openxmlformats.org/drawingml/2006/picture" xmlns:wp="http://schemas.openxmlformats.org/drawingml/2006/wordprocessingDrawing">
   <w:body>
-    <w:bookmarkStart w:id="45" w:name="X81e7d74b1eda00f5b1fa1d2575e873055a88a0c"/>
+    <w:bookmarkStart w:id="50" w:name="X81e7d74b1eda00f5b1fa1d2575e873055a88a0c"/>
     <w:p>
       <w:pPr>
         <w:pStyle w:val="Heading1"/>
       </w:pPr>
       <w:r>
         <w:t xml:space="preserve">The Whack-a-Mole Effect in AI Code Repair: Static-Analysis Findings and Code Complexity After Scanner-Guided Fixes</w:t>
+      </w:r>
+    </w:p>
+    <w:bookmarkStart w:id="11" w:name="X9c26ed4eb7b15af78a325c305d15a96eaf5ae67"/>
+    <w:p>
+      <w:pPr>
+        <w:pStyle w:val="Heading3"/>
+      </w:pPr>
+      <w:r>
+        <w:t xml:space="preserve">A Preliminary Pilot Study and Empirical Feasibility Assessment</w:t>
       </w:r>
     </w:p>
     <w:p>
@@ -55,7 +64,7 @@
         <w:br/>
       </w:r>
       <w:r>
-        <w:t xml:space="preserve">Repository:</w:t>
+        <w:t xml:space="preserve">Research Repository:</w:t>
       </w:r>
       <w:r>
         <w:t xml:space="preserve"> </w:t>
@@ -76,7 +85,8 @@
         </w:pict>
       </w:r>
     </w:p>
-    <w:bookmarkStart w:id="11" w:name="abstract"/>
+    <w:bookmarkEnd w:id="11"/>
+    <w:bookmarkStart w:id="12" w:name="abstract"/>
     <w:p>
       <w:pPr>
         <w:pStyle w:val="Heading2"/>
@@ -90,7 +100,7 @@
         <w:pStyle w:val="FirstParagraph"/>
       </w:pPr>
       <w:r>
-        <w:t xml:space="preserve">Large language models (LLMs) specialized for software engineering frequently generate code containing security vulnerabilities. A common remediation strategy is</w:t>
+        <w:t xml:space="preserve">Large language models (LLMs) specialized for software engineering frequently generate code containing security weaknesses. A widely proposed automated mitigation strategy is</w:t>
       </w:r>
       <w:r>
         <w:t xml:space="preserve"> </w:t>
@@ -103,7 +113,7 @@
         <w:t xml:space="preserve">scanner-guided repair</w:t>
       </w:r>
       <w:r>
-        <w:t xml:space="preserve">, wherein a static analysis tool inspects generated code and feeds alert diagnostics back to the model for iterative fixing. However, empirical understanding of how models respond to real static-analysis alerts remains incomplete. In this study, we investigate the</w:t>
+        <w:t xml:space="preserve">, wherein a static application security testing (SAST) tool inspects generated code and feeds diagnostic alert messages back to the model to guide an iterative fix. In this preliminary working paper, we investigate the</w:t>
       </w:r>
       <w:r>
         <w:t xml:space="preserve"> </w:t>
@@ -127,10 +137,10 @@
           <w:b/>
           <w:bCs/>
         </w:rPr>
-        <w:t xml:space="preserve">effect</w:t>
-      </w:r>
-      <w:r>
-        <w:t xml:space="preserve">: when an AI model repairs Python code in response to authentic static-analysis findings, does it successfully eliminate the original alerts, leave findings unresolved, introduce new distinct findings, or increase structural code complexity?</w:t>
+        <w:t xml:space="preserve">hypothesis</w:t>
+      </w:r>
+      <w:r>
+        <w:t xml:space="preserve">: when an AI model repairs generated Python code using actual static-analysis findings, does the repair remove existing alerts while leaving some unresolved, introduce new secondary alert instances, or increase structural code complexity?</w:t>
       </w:r>
     </w:p>
     <w:p>
@@ -138,7 +148,23 @@
         <w:pStyle w:val="BodyText"/>
       </w:pPr>
       <w:r>
-        <w:t xml:space="preserve">We establish an empirical evaluation pipeline integrating the LLMSecEval benchmark, the official GitHub CodeQL CLI (analyzing 52 security and taint-tracking queries), and the Qwen2.5-Coder family under three controlled conditions:</w:t>
+        <w:t xml:space="preserve">We establish an automated evaluation harness coupling the LLMSecEval benchmark, the official GitHub CodeQL CLI (evaluating 52 security and taint-tracking queries), and the open-weight</w:t>
+      </w:r>
+      <w:r>
+        <w:t xml:space="preserve"> </w:t>
+      </w:r>
+      <w:r>
+        <w:rPr>
+          <w:b/>
+          <w:bCs/>
+        </w:rPr>
+        <w:t xml:space="preserve">Qwen2.5-Coder-1.5B-Instruct</w:t>
+      </w:r>
+      <w:r>
+        <w:t xml:space="preserve"> </w:t>
+      </w:r>
+      <w:r>
+        <w:t xml:space="preserve">model across three controlled experimental conditions:</w:t>
       </w:r>
       <w:r>
         <w:t xml:space="preserve"> </w:t>
@@ -174,25 +200,39 @@
           <w:i/>
           <w:iCs/>
         </w:rPr>
-        <w:t xml:space="preserve">(C) Scanner-guided repair</w:t>
-      </w:r>
-      <w:r>
-        <w:t xml:space="preserve">. To ensure experimental validity, we benchmark the CodeQL analysis against positive and negative ground-truth controls. Our empirical findings demonstrate that: (1) security-aware prompting is completely ineffective at suppressing baseline vulnerabilities (100% alert persistence across tested tasks); (2) scanner-guided repair successfully resolves localized configuration findings (e.g., removing</w:t>
-      </w:r>
-      <w:r>
-        <w:t xml:space="preserve"> </w:t>
+        <w:t xml:space="preserve">(C) Closed-loop scanner-guided repair</w:t>
+      </w:r>
+      <w:r>
+        <w:t xml:space="preserve">. Before experimental execution, we validate the CodeQL harness against ground-truth positive (Flask untrusted redirect in debug mode) and negative controls, confirming identical detection across CSV and SARIF outputs. In an initial three-task pilot evaluation (</w:t>
+      </w:r>
+      <m:oMath>
+        <m:r>
+          <m:t>N</m:t>
+        </m:r>
+        <m:r>
+          <m:rPr>
+            <m:sty m:val="p"/>
+          </m:rPr>
+          <m:t>=</m:t>
+        </m:r>
+        <m:r>
+          <m:t>3</m:t>
+        </m:r>
+      </m:oMath>
+      <w:r>
+        <w:t xml:space="preserve"> </w:t>
+      </w:r>
+      <w:r>
+        <w:t xml:space="preserve">Python tasks from LLMSecEval), we observe that: (1) security-aware prompting was completely ineffective at suppressing baseline alerts (100% alert persistence across all 4 baseline alert instances); (2) scanner-guided repair resolved a localized configuration flaw (</w:t>
       </w:r>
       <w:r>
         <w:rPr>
           <w:rStyle w:val="VerbatimChar"/>
         </w:rPr>
-        <w:t xml:space="preserve">Flask debug mode</w:t>
-      </w:r>
-      <w:r>
-        <w:t xml:space="preserve">), but fails to resolve deeper dataflow taint-tracking vulnerabilities (e.g.,</w:t>
-      </w:r>
-      <w:r>
-        <w:t xml:space="preserve"> </w:t>
+        <w:t xml:space="preserve">Flask app is run in debug mode</w:t>
+      </w:r>
+      <w:r>
+        <w:t xml:space="preserve">, 1/4 alerts, 25.0% resolution rate), but failed to eliminate dataflow taint-tracking alerts (</w:t>
       </w:r>
       <w:r>
         <w:rPr>
@@ -201,7 +241,85 @@
         <w:t xml:space="preserve">URL redirection from remote source</w:t>
       </w:r>
       <w:r>
-        <w:t xml:space="preserve">), resulting in a 75% alert persistence rate; (3) no new secondary findings were introduced in the tested sample; and (4) cyclomatic complexity and logical lines of code remained stable. We provide task-level audit trails, reproducible artifacts, and actionable recommendations for AI-assisted secure software engineering.</w:t>
+        <w:t xml:space="preserve">, 3/4 alerts, 75.0% persistence rate); (3) no new secondary findings were introduced in evaluable cases (</w:t>
+      </w:r>
+      <m:oMath>
+        <m:r>
+          <m:rPr>
+            <m:nor/>
+            <m:sty m:val="p"/>
+          </m:rPr>
+          <m:t>New</m:t>
+        </m:r>
+        <m:r>
+          <m:rPr>
+            <m:sty m:val="p"/>
+          </m:rPr>
+          <m:t>=</m:t>
+        </m:r>
+        <m:r>
+          <m:t>0</m:t>
+        </m:r>
+      </m:oMath>
+      <w:r>
+        <w:t xml:space="preserve">); and (4) Radon cyclomatic complexity and logical lines of code remained unchanged across repairs (</w:t>
+      </w:r>
+      <m:oMath>
+        <m:r>
+          <m:rPr>
+            <m:sty m:val="p"/>
+          </m:rPr>
+          <m:t>Δ</m:t>
+        </m:r>
+        <m:r>
+          <m:rPr>
+            <m:nor/>
+            <m:sty m:val="p"/>
+          </m:rPr>
+          <m:t>CC</m:t>
+        </m:r>
+        <m:r>
+          <m:rPr>
+            <m:sty m:val="p"/>
+          </m:rPr>
+          <m:t>=</m:t>
+        </m:r>
+        <m:r>
+          <m:t>0</m:t>
+        </m:r>
+      </m:oMath>
+      <w:r>
+        <w:t xml:space="preserve">,</w:t>
+      </w:r>
+      <w:r>
+        <w:t xml:space="preserve"> </w:t>
+      </w:r>
+      <m:oMath>
+        <m:r>
+          <m:rPr>
+            <m:sty m:val="p"/>
+          </m:rPr>
+          <m:t>Δ</m:t>
+        </m:r>
+        <m:r>
+          <m:rPr>
+            <m:nor/>
+            <m:sty m:val="p"/>
+          </m:rPr>
+          <m:t>LOC</m:t>
+        </m:r>
+        <m:r>
+          <m:rPr>
+            <m:sty m:val="p"/>
+          </m:rPr>
+          <m:t>=</m:t>
+        </m:r>
+        <m:r>
+          <m:t>0</m:t>
+        </m:r>
+      </m:oMath>
+      <w:r>
+        <w:t xml:space="preserve">). While constrained by a pilot sample size, these preliminary findings suggest that naive diagnostic feedback enables models to patch literal configuration flags but fails to prompt architectural sanitization for dataflow vulnerabilities, highlighting the need for structured template guidance in automated AI program repair.</w:t>
       </w:r>
     </w:p>
     <w:p>
@@ -219,7 +337,7 @@
         <w:t xml:space="preserve"> </w:t>
       </w:r>
       <w:r>
-        <w:t xml:space="preserve">AI Code Generation, Automated Program Repair, Static Application Security Testing, CodeQL, Vulnerability Remediation, Whack-a-Mole Effect, Software Engineering.</w:t>
+        <w:t xml:space="preserve">AI Code Generation, Automated Program Repair, Static Application Security Testing, CodeQL, Vulnerability Remediation, Whack-a-Mole Effect, Software Security.</w:t>
       </w:r>
     </w:p>
     <w:p>
@@ -229,8 +347,8 @@
         </w:pict>
       </w:r>
     </w:p>
-    <w:bookmarkEnd w:id="11"/>
-    <w:bookmarkStart w:id="13" w:name="introduction"/>
+    <w:bookmarkEnd w:id="12"/>
+    <w:bookmarkStart w:id="14" w:name="introduction"/>
     <w:p>
       <w:pPr>
         <w:pStyle w:val="Heading2"/>
@@ -244,7 +362,7 @@
         <w:pStyle w:val="FirstParagraph"/>
       </w:pPr>
       <w:r>
-        <w:t xml:space="preserve">The rapid integration of Large Language Models (LLMs) into developer workflows—exemplified by GitHub Copilot, Cursor, and ChatGPT—has fundamentally altered software development. While these models substantially accelerate prototyping and code completion, foundational empirical studies have demonstrated that approximately 40% of AI-generated code snippets contain severe security vulnerabilities, including Common Weakness Enumerations (CWEs) from the MITRE Top 25 (Pearce et al., 2022; Tony et al., 2023).</w:t>
+        <w:t xml:space="preserve">The integration of Large Language Models (LLMs) into code generation workflows has accelerated developer velocity but introduced substantial security concerns. Seminal empirical studies report that approximately 40% of code completions generated by state-of-the-art models contain security vulnerabilities, including Common Weakness Enumerations (CWEs) from the MITRE Top 25 (Pearce et al., 2022; Tony et al., 2023).</w:t>
       </w:r>
     </w:p>
     <w:p>
@@ -252,7 +370,7 @@
         <w:pStyle w:val="BodyText"/>
       </w:pPr>
       <w:r>
-        <w:t xml:space="preserve">To mitigate this risk, two primary prompt-based paradigms have emerged:</w:t>
+        <w:t xml:space="preserve">To address this challenge, two prompt-engineering remediation strategies are commonly deployed:</w:t>
       </w:r>
       <w:r>
         <w:t xml:space="preserve"> </w:t>
@@ -290,7 +408,7 @@
         <w:t xml:space="preserve"> </w:t>
       </w:r>
       <w:r>
-        <w:t xml:space="preserve">to produce secure, vulnerability-free code.</w:t>
+        <w:t xml:space="preserve">through a system or user prompt constraint to generate secure, vulnerability-free code.</w:t>
       </w:r>
       <w:r>
         <w:t xml:space="preserve"> </w:t>
@@ -312,7 +430,7 @@
         <w:t xml:space="preserve"> </w:t>
       </w:r>
       <w:r>
-        <w:t xml:space="preserve">Analyzing candidate completions with a Static Application Security Testing (SAST) tool and providing the diagnostic messages (rule ID, file location, description) back to the LLM to guide a targeted fix.</w:t>
+        <w:t xml:space="preserve">Analyzing candidate completions with a Static Application Security Testing (SAST) tool and feeding the diagnostic error text (rule identifier, error message, line location) back to the LLM to request a targeted repair.</w:t>
       </w:r>
     </w:p>
     <w:p>
@@ -320,7 +438,7 @@
         <w:pStyle w:val="BodyText"/>
       </w:pPr>
       <w:r>
-        <w:t xml:space="preserve">While scanner-guided repair is intuitive, practitioners in automated program repair often observe a phenomenon metaphorically termed the</w:t>
+        <w:t xml:space="preserve">While scanner-guided repair represents an intuitive closed-loop approach, practitioners in program repair have observed a potential drawback metaphorically termed the</w:t>
       </w:r>
       <w:r>
         <w:t xml:space="preserve"> </w:t>
@@ -347,16 +465,16 @@
         <w:t xml:space="preserve">effect</w:t>
       </w:r>
       <w:r>
-        <w:t xml:space="preserve">: attempting to eliminate one static analysis alert may cause the model to introduce alternative bugs, shift taint sinks elsewhere, or inflate code complexity through defensive workarounds without actually neutralizing the underlying threat.</w:t>
-      </w:r>
-    </w:p>
-    <w:bookmarkStart w:id="12" w:name="research-questions"/>
+        <w:t xml:space="preserve">: attempting to resolve one static analysis finding may cause the model to introduce secondary bugs elsewhere, shift taint sinks, or inflate code complexity through bloated wrappers without actually resolving the root security weakness.</w:t>
+      </w:r>
+    </w:p>
+    <w:bookmarkStart w:id="13" w:name="scope-and-research-questions"/>
     <w:p>
       <w:pPr>
         <w:pStyle w:val="Heading3"/>
       </w:pPr>
       <w:r>
-        <w:t xml:space="preserve">1.1 Research Questions</w:t>
+        <w:t xml:space="preserve">1.1 Scope and Research Questions</w:t>
       </w:r>
     </w:p>
     <w:p>
@@ -364,7 +482,23 @@
         <w:pStyle w:val="FirstParagraph"/>
       </w:pPr>
       <w:r>
-        <w:t xml:space="preserve">To rigorously assess this phenomenon, we formulate three core research questions:</w:t>
+        <w:t xml:space="preserve">This paper presents a</w:t>
+      </w:r>
+      <w:r>
+        <w:t xml:space="preserve"> </w:t>
+      </w:r>
+      <w:r>
+        <w:rPr>
+          <w:b/>
+          <w:bCs/>
+        </w:rPr>
+        <w:t xml:space="preserve">preliminary pilot study</w:t>
+      </w:r>
+      <w:r>
+        <w:t xml:space="preserve"> </w:t>
+      </w:r>
+      <w:r>
+        <w:t xml:space="preserve">investigating the feasibility and dynamics of closed-loop CodeQL repair on Python code. We formulate three exploratory research questions:</w:t>
       </w:r>
     </w:p>
     <w:p>
@@ -390,7 +524,7 @@
           <w:i/>
           <w:iCs/>
         </w:rPr>
-        <w:t xml:space="preserve">To what extent does feeding authentic CodeQL static-analysis alerts back to the model result in the complete elimination of original vulnerabilities versus their persistence?</w:t>
+        <w:t xml:space="preserve">To what extent does feeding authentic CodeQL static-analysis findings back to the model result in the complete elimination versus persistence of original alert instances?</w:t>
       </w:r>
     </w:p>
     <w:p>
@@ -416,35 +550,7 @@
           <w:i/>
           <w:iCs/>
         </w:rPr>
-        <w:t xml:space="preserve">Does scanner-guided repair trigger a</w:t>
-      </w:r>
-      <w:r>
-        <w:rPr>
-          <w:i/>
-          <w:iCs/>
-        </w:rPr>
-        <w:t xml:space="preserve"> </w:t>
-      </w:r>
-      <w:r>
-        <w:rPr>
-          <w:i/>
-          <w:iCs/>
-        </w:rPr>
-        <w:t xml:space="preserve">“Whack-a-Mole”</w:t>
-      </w:r>
-      <w:r>
-        <w:rPr>
-          <w:i/>
-          <w:iCs/>
-        </w:rPr>
-        <w:t xml:space="preserve"> </w:t>
-      </w:r>
-      <w:r>
-        <w:rPr>
-          <w:i/>
-          <w:iCs/>
-        </w:rPr>
-        <w:t xml:space="preserve">dynamic by introducing new, distinct static-analysis findings not present in the baseline code?</w:t>
+        <w:t xml:space="preserve">Does scanner-guided repair introduce new, distinct static-analysis findings not present in the baseline code (the Whack-a-Mole dynamic)?</w:t>
       </w:r>
     </w:p>
     <w:p>
@@ -470,7 +576,7 @@
           <w:i/>
           <w:iCs/>
         </w:rPr>
-        <w:t xml:space="preserve">Does scanner-guided repair inflate the structural complexity of the code, as measured by Cyclomatic Complexity (CC) and Logical Lines of Code (LOC)?</w:t>
+        <w:t xml:space="preserve">Does scanner-guided repair alter the structural complexity of generated code, as measured by Cyclomatic Complexity (CC) and Logical Lines of Code (LOC)?</w:t>
       </w:r>
     </w:p>
     <w:p>
@@ -480,15 +586,15 @@
         </w:pict>
       </w:r>
     </w:p>
-    <w:bookmarkEnd w:id="12"/>
     <w:bookmarkEnd w:id="13"/>
-    <w:bookmarkStart w:id="14" w:name="related-work"/>
+    <w:bookmarkEnd w:id="14"/>
+    <w:bookmarkStart w:id="15" w:name="related-work-and-research-grounding"/>
     <w:p>
       <w:pPr>
         <w:pStyle w:val="Heading2"/>
       </w:pPr>
       <w:r>
-        <w:t xml:space="preserve">2. Related Work</w:t>
+        <w:t xml:space="preserve">2. Related Work and Research Grounding</w:t>
       </w:r>
     </w:p>
     <w:p>
@@ -496,7 +602,7 @@
         <w:pStyle w:val="FirstParagraph"/>
       </w:pPr>
       <w:r>
-        <w:t xml:space="preserve">Table 1 summarizes key prior literature in LLM code security and situates our experimental contributions.</w:t>
+        <w:t xml:space="preserve">Table 1 summarizes foundational literature evaluating LLM security and highlights the positioning of this preliminary study.</w:t>
       </w:r>
     </w:p>
     <w:tbl>
@@ -562,7 +668,7 @@
               <w:jc w:val="left"/>
             </w:pPr>
             <w:r>
-              <w:t xml:space="preserve">Scanner Feedback Loop?</w:t>
+              <w:t xml:space="preserve">SAST Feedback Loop?</w:t>
             </w:r>
           </w:p>
         </w:tc>
@@ -586,7 +692,7 @@
               <w:jc w:val="left"/>
             </w:pPr>
             <w:r>
-              <w:t xml:space="preserve">Primary Finding</w:t>
+              <w:t xml:space="preserve">Key Findings</w:t>
             </w:r>
           </w:p>
         </w:tc>
@@ -664,7 +770,7 @@
               <w:jc w:val="left"/>
             </w:pPr>
             <w:r>
-              <w:t xml:space="preserve">~40% of completions contained high-severity CWEs.</w:t>
+              <w:t xml:space="preserve">~40% of completions contained high-severity CWEs across multiple languages.</w:t>
             </w:r>
           </w:p>
         </w:tc>
@@ -682,7 +788,7 @@
                 <w:b/>
                 <w:bCs/>
               </w:rPr>
-              <w:t xml:space="preserve">Siddiq et al. (2022)</w:t>
+              <w:t xml:space="preserve">Siddiq &amp; Santos (2022)</w:t>
             </w:r>
           </w:p>
         </w:tc>
@@ -742,7 +848,7 @@
               <w:jc w:val="left"/>
             </w:pPr>
             <w:r>
-              <w:t xml:space="preserve">Security prompts slightly improve but fail on subtle CWEs.</w:t>
+              <w:t xml:space="preserve">Security-oriented prompts slightly improve outcomes but fail on subtle CWEs.</w:t>
             </w:r>
           </w:p>
         </w:tc>
@@ -820,7 +926,7 @@
               <w:jc w:val="left"/>
             </w:pPr>
             <w:r>
-              <w:t xml:space="preserve">LLMs struggle with architectural and injection vulnerabilities.</w:t>
+              <w:t xml:space="preserve">Open-source LLMs struggle with architectural and injection vulnerabilities.</w:t>
             </w:r>
           </w:p>
         </w:tc>
@@ -898,7 +1004,19 @@
               <w:jc w:val="left"/>
             </w:pPr>
             <w:r>
-              <w:t xml:space="preserve">Models often produce security theater; fixes fail deeper scrutiny.</w:t>
+              <w:t xml:space="preserve">Conversational repair frequently generates</w:t>
+            </w:r>
+            <w:r>
+              <w:t xml:space="preserve"> </w:t>
+            </w:r>
+            <w:r>
+              <w:t xml:space="preserve">“security theater”</w:t>
+            </w:r>
+            <w:r>
+              <w:t xml:space="preserve"> </w:t>
+            </w:r>
+            <w:r>
+              <w:t xml:space="preserve">that fails deeper inspection.</w:t>
             </w:r>
           </w:p>
         </w:tc>
@@ -916,7 +1034,7 @@
                 <w:b/>
                 <w:bCs/>
               </w:rPr>
-              <w:t xml:space="preserve">This Study</w:t>
+              <w:t xml:space="preserve">This Study (Pilot)</w:t>
             </w:r>
           </w:p>
         </w:tc>
@@ -956,7 +1074,7 @@
                 <w:b/>
                 <w:bCs/>
               </w:rPr>
-              <w:t xml:space="preserve">Yes (Condition C closed loop)</w:t>
+              <w:t xml:space="preserve">Yes (Closed-loop Condition C)</w:t>
             </w:r>
           </w:p>
         </w:tc>
@@ -988,7 +1106,7 @@
                 <w:b/>
                 <w:bCs/>
               </w:rPr>
-              <w:t xml:space="preserve">Quantifies alert persistence, disappearance, and complexity shifts.</w:t>
+              <w:t xml:space="preserve">Quantifies alert persistence, disappearance, and complexity shifts in a controlled pilot.</w:t>
             </w:r>
           </w:p>
         </w:tc>
@@ -1003,7 +1121,7 @@
           <w:i/>
           <w:iCs/>
         </w:rPr>
-        <w:t xml:space="preserve">Table 1: Systematic comparison of related literature against this study’s experimental design.</w:t>
+        <w:t xml:space="preserve">Table 1: Comparison of related literature against this study’s experimental design.</w:t>
       </w:r>
     </w:p>
     <w:p>
@@ -1011,7 +1129,7 @@
         <w:pStyle w:val="BodyText"/>
       </w:pPr>
       <w:r>
-        <w:t xml:space="preserve">Unlike prior evaluations that rely purely on open-ended generation or surface-level pattern linters (such as Bandit), our framework integrates the industrial-grade GitHub CodeQL semantic analysis engine to provide precise taint-flow feedback to modern open-weight code generation models.</w:t>
+        <w:t xml:space="preserve">Unlike prior benchmarks that focus exclusively on one-pass generation or rely on surface-level regex linters (e.g., Bandit), our pipeline integrates the official GitHub CodeQL semantic taint-tracking engine into a closed feedback loop with model-agnostic metric logging.</w:t>
       </w:r>
     </w:p>
     <w:p>
@@ -1021,8 +1139,8 @@
         </w:pict>
       </w:r>
     </w:p>
-    <w:bookmarkEnd w:id="14"/>
-    <w:bookmarkStart w:id="19" w:name="experimental-methodology"/>
+    <w:bookmarkEnd w:id="15"/>
+    <w:bookmarkStart w:id="20" w:name="experimental-methodology"/>
     <w:p>
       <w:pPr>
         <w:pStyle w:val="Heading2"/>
@@ -1031,7 +1149,7 @@
         <w:t xml:space="preserve">3. Experimental Methodology</w:t>
       </w:r>
     </w:p>
-    <w:bookmarkStart w:id="15" w:name="experimental-conditions"/>
+    <w:bookmarkStart w:id="16" w:name="experimental-conditions"/>
     <w:p>
       <w:pPr>
         <w:pStyle w:val="Heading3"/>
@@ -1045,7 +1163,7 @@
         <w:pStyle w:val="FirstParagraph"/>
       </w:pPr>
       <w:r>
-        <w:t xml:space="preserve">We lock three distinct experimental conditions for every evaluated prompt:</w:t>
+        <w:t xml:space="preserve">We specify three controlled experimental conditions:</w:t>
       </w:r>
     </w:p>
     <w:p>
@@ -1067,7 +1185,7 @@
         <w:t xml:space="preserve"> </w:t>
       </w:r>
       <w:r>
-        <w:t xml:space="preserve">The model receives the raw natural language specification from the benchmark without security modification:</w:t>
+        <w:t xml:space="preserve">The model receives the raw natural language specification from the benchmark without security instructions:</w:t>
       </w:r>
     </w:p>
     <w:p>
@@ -1147,7 +1265,7 @@
         <w:t xml:space="preserve"> </w:t>
       </w:r>
       <w:r>
-        <w:t xml:space="preserve">The model receives the baseline prompt augmented with an explicit security constraint:</w:t>
+        <w:t xml:space="preserve">The baseline prompt is augmented with an explicit security directive:</w:t>
       </w:r>
     </w:p>
     <w:p>
@@ -1222,7 +1340,7 @@
               <m:nor/>
               <m:sty m:val="p"/>
             </m:rPr>
-            <m:t>"Ensure your code is highly secure and mitigates all potential vulnerabilities including CWEs."</m:t>
+            <m:t>"Ensure code is secure and mitigates CWEs"</m:t>
           </m:r>
           <m:r>
             <m:rPr>
@@ -1279,7 +1397,7 @@
         <w:t xml:space="preserve"> </w:t>
       </w:r>
       <w:r>
-        <w:t xml:space="preserve">yielding a non-empty set of static analysis alerts</w:t>
+        <w:t xml:space="preserve">yielding a non-empty set of CodeQL alerts</w:t>
       </w:r>
       <w:r>
         <w:t xml:space="preserve"> </w:t>
@@ -1381,7 +1499,7 @@
         </m:r>
       </m:oMath>
       <w:r>
-        <w:t xml:space="preserve">, we construct a diagnostic prompt containing the exact rule IDs, error messages, and line numbers:</w:t>
+        <w:t xml:space="preserve">, we construct a diagnostic prompt containing the exact rule identifiers, descriptions, and line locations:</w:t>
       </w:r>
     </w:p>
     <w:p>
@@ -1424,7 +1542,7 @@
               <m:nor/>
               <m:sty m:val="p"/>
             </m:rPr>
-            <m:t>RepairPrompt</m:t>
+            <m:t>FormatPrompt</m:t>
           </m:r>
           <m:r>
             <m:rPr>
@@ -1524,109 +1642,17 @@
         </m:r>
       </m:oMath>
       <w:r>
-        <w:t xml:space="preserve">, Condition C is recorded as clean, and repair is not invoked.</w:t>
-      </w:r>
-    </w:p>
-    <w:p>
-      <w:pPr>
-        <w:pStyle w:val="SourceCode"/>
-      </w:pPr>
-      <w:r>
-        <w:rPr>
-          <w:rStyle w:val="VerbatimChar"/>
-        </w:rPr>
-        <w:t xml:space="preserve">graph TD</w:t>
-      </w:r>
-      <w:r>
-        <w:br/>
-      </w:r>
-      <w:r>
-        <w:rPr>
-          <w:rStyle w:val="VerbatimChar"/>
-        </w:rPr>
-        <w:t xml:space="preserve">    Prompt[Task Prompt] --&gt;|Generate| CondA[Condition A: Baseline Code]</w:t>
-      </w:r>
-      <w:r>
-        <w:br/>
-      </w:r>
-      <w:r>
-        <w:rPr>
-          <w:rStyle w:val="VerbatimChar"/>
-        </w:rPr>
-        <w:t xml:space="preserve">    Prompt --&gt;|Security Prefix| CondB[Condition B: Security-Aware Code]</w:t>
-      </w:r>
-      <w:r>
-        <w:br/>
-      </w:r>
-      <w:r>
-        <w:rPr>
-          <w:rStyle w:val="VerbatimChar"/>
-        </w:rPr>
-        <w:t xml:space="preserve">    CondA --&gt;|Scan| CodeQL_A[CodeQL Analysis A]</w:t>
-      </w:r>
-      <w:r>
-        <w:br/>
-      </w:r>
-      <w:r>
-        <w:rPr>
-          <w:rStyle w:val="VerbatimChar"/>
-        </w:rPr>
-        <w:t xml:space="preserve">    CondB --&gt;|Scan| CodeQL_B[CodeQL Analysis B]</w:t>
-      </w:r>
-      <w:r>
-        <w:br/>
-      </w:r>
-      <w:r>
-        <w:rPr>
-          <w:rStyle w:val="VerbatimChar"/>
-        </w:rPr>
-        <w:t xml:space="preserve">    CodeQL_A --&gt;|Alerts Found| RepairPrompt[Construct Repair Prompt]</w:t>
-      </w:r>
-      <w:r>
-        <w:br/>
-      </w:r>
-      <w:r>
-        <w:rPr>
-          <w:rStyle w:val="VerbatimChar"/>
-        </w:rPr>
-        <w:t xml:space="preserve">    CodeQL_A --&gt;|0 Alerts| Pass[Record Clean Baseline]</w:t>
-      </w:r>
-      <w:r>
-        <w:br/>
-      </w:r>
-      <w:r>
-        <w:rPr>
-          <w:rStyle w:val="VerbatimChar"/>
-        </w:rPr>
-        <w:t xml:space="preserve">    RepairPrompt --&gt;|Generate| CondC[Condition C: Repaired Code]</w:t>
-      </w:r>
-      <w:r>
-        <w:br/>
-      </w:r>
-      <w:r>
-        <w:rPr>
-          <w:rStyle w:val="VerbatimChar"/>
-        </w:rPr>
-        <w:t xml:space="preserve">    CondC --&gt;|Scan| CodeQL_C[CodeQL Analysis C]</w:t>
-      </w:r>
-      <w:r>
-        <w:br/>
-      </w:r>
-      <w:r>
-        <w:rPr>
-          <w:rStyle w:val="VerbatimChar"/>
-        </w:rPr>
-        <w:t xml:space="preserve">    CodeQL_C --&gt; MetricEval[Compare Alerts &amp; Measure Radon CC / LOC]</w:t>
-      </w:r>
-    </w:p>
-    <w:bookmarkEnd w:id="15"/>
-    <w:bookmarkStart w:id="16" w:name="evaluation-engine-query-suite"/>
+        <w:t xml:space="preserve">, Condition C is recorded as clean, and repair is not invoked (avoiding false repair counts).</w:t>
+      </w:r>
+    </w:p>
+    <w:bookmarkEnd w:id="16"/>
+    <w:bookmarkStart w:id="17" w:name="evaluation-engine-and-query-suite"/>
     <w:p>
       <w:pPr>
         <w:pStyle w:val="Heading3"/>
       </w:pPr>
       <w:r>
-        <w:t xml:space="preserve">3.2 Evaluation Engine &amp; Query Suite</w:t>
+        <w:t xml:space="preserve">3.2 Evaluation Engine and Query Suite</w:t>
       </w:r>
     </w:p>
     <w:p>
@@ -1671,29 +1697,29 @@
         <w:t xml:space="preserve"> </w:t>
       </w:r>
       <w:r>
-        <w:t xml:space="preserve">- Injections: SQL (CWE-089), Command (CWE-078), Code (CWE-094), LDAP (CWE-090).</w:t>
-      </w:r>
-      <w:r>
-        <w:t xml:space="preserve"> </w:t>
-      </w:r>
-      <w:r>
-        <w:t xml:space="preserve">- Web Security: Reflected XSS (CWE-079), Untrusted URL Redirection (CWE-601), CSRF (CWE-352).</w:t>
-      </w:r>
-      <w:r>
-        <w:t xml:space="preserve"> </w:t>
-      </w:r>
-      <w:r>
-        <w:t xml:space="preserve">- Sensitive Data &amp; Config: Cleartext Logging (CWE-312), Hardcoded Credentials (CWE-798), Flask Debug Mode (CWE-215).</w:t>
-      </w:r>
-    </w:p>
-    <w:bookmarkEnd w:id="16"/>
-    <w:bookmarkStart w:id="17" w:name="verification-of-sast-controls"/>
+        <w:t xml:space="preserve">- Injections: SQL Injection (CWE-089), Command Injection (CWE-078), Code Injection (CWE-094), LDAP Injection (CWE-090).</w:t>
+      </w:r>
+      <w:r>
+        <w:t xml:space="preserve"> </w:t>
+      </w:r>
+      <w:r>
+        <w:t xml:space="preserve">- Web Security: Untrusted URL Redirection (CWE-601), Reflected XSS (CWE-079), CSRF Disabled (CWE-352).</w:t>
+      </w:r>
+      <w:r>
+        <w:t xml:space="preserve"> </w:t>
+      </w:r>
+      <w:r>
+        <w:t xml:space="preserve">- Sensitive Data &amp; Configuration: Flask Debug Mode (CWE-215), Cleartext Logging (CWE-312), Hardcoded Credentials (CWE-798).</w:t>
+      </w:r>
+    </w:p>
+    <w:bookmarkEnd w:id="17"/>
+    <w:bookmarkStart w:id="18" w:name="Xcd97904ba2085fddf0a13bf36e03794ad802dfe"/>
     <w:p>
       <w:pPr>
         <w:pStyle w:val="Heading3"/>
       </w:pPr>
       <w:r>
-        <w:t xml:space="preserve">3.3 Verification of SAST Controls</w:t>
+        <w:t xml:space="preserve">3.3 Verification of Ground-Truth SAST Controls</w:t>
       </w:r>
     </w:p>
     <w:p>
@@ -1701,7 +1727,16 @@
         <w:pStyle w:val="FirstParagraph"/>
       </w:pPr>
       <w:r>
-        <w:t xml:space="preserve">To eliminate threats of false positives or scanner silence, we execute validation tests on ground-truth controls before experiment execution:</w:t>
+        <w:t xml:space="preserve">To eliminate threats of scanner misconfiguration or silent parsing failures, we executed ground-truth control validations (</w:t>
+      </w:r>
+      <w:r>
+        <w:rPr>
+          <w:rStyle w:val="VerbatimChar"/>
+        </w:rPr>
+        <w:t xml:space="preserve">tests/test_codeql_controls.py</w:t>
+      </w:r>
+      <w:r>
+        <w:t xml:space="preserve">) prior to experimental execution:</w:t>
       </w:r>
       <w:r>
         <w:t xml:space="preserve"> </w:t>
@@ -1723,7 +1758,23 @@
         <w:t xml:space="preserve"> </w:t>
       </w:r>
       <w:r>
-        <w:t xml:space="preserve">A Flask endpoint accepting untrusted URL parameters and executing in debug mode. Verified output:</w:t>
+        <w:t xml:space="preserve">A Flask web endpoint accepting an unvalidated URL query parameter and running in debug mode.</w:t>
+      </w:r>
+      <w:r>
+        <w:br/>
+      </w:r>
+      <w:r>
+        <w:rPr>
+          <w:i/>
+          <w:iCs/>
+        </w:rPr>
+        <w:t xml:space="preserve">Result:</w:t>
+      </w:r>
+      <w:r>
+        <w:t xml:space="preserve"> </w:t>
+      </w:r>
+      <w:r>
+        <w:t xml:space="preserve">CodeQL flagged exactly</w:t>
       </w:r>
       <w:r>
         <w:t xml:space="preserve"> </w:t>
@@ -1748,7 +1799,10 @@
         <w:t xml:space="preserve">py/flask-debug</w:t>
       </w:r>
       <w:r>
-        <w:t xml:space="preserve">,</w:t>
+        <w:t xml:space="preserve"> </w:t>
+      </w:r>
+      <w:r>
+        <w:t xml:space="preserve">[CWE-215] and</w:t>
       </w:r>
       <w:r>
         <w:t xml:space="preserve"> </w:t>
@@ -1760,7 +1814,10 @@
         <w:t xml:space="preserve">py/url-redirection</w:t>
       </w:r>
       <w:r>
-        <w:t xml:space="preserve">) parsed identically across CSV and SARIF.</w:t>
+        <w:t xml:space="preserve"> </w:t>
+      </w:r>
+      <w:r>
+        <w:t xml:space="preserve">[CWE-601]), verified identically across both CSV and SARIF outputs.</w:t>
       </w:r>
       <w:r>
         <w:t xml:space="preserve"> </w:t>
@@ -1782,7 +1839,41 @@
         <w:t xml:space="preserve"> </w:t>
       </w:r>
       <w:r>
-        <w:t xml:space="preserve">An internal static redirect with debug disabled. Verified output:</w:t>
+        <w:t xml:space="preserve">An internal static redirect (</w:t>
+      </w:r>
+      <w:r>
+        <w:rPr>
+          <w:rStyle w:val="VerbatimChar"/>
+        </w:rPr>
+        <w:t xml:space="preserve">redirect("/dashboard")</w:t>
+      </w:r>
+      <w:r>
+        <w:t xml:space="preserve">) with debug disabled (</w:t>
+      </w:r>
+      <w:r>
+        <w:rPr>
+          <w:rStyle w:val="VerbatimChar"/>
+        </w:rPr>
+        <w:t xml:space="preserve">debug=False</w:t>
+      </w:r>
+      <w:r>
+        <w:t xml:space="preserve">).</w:t>
+      </w:r>
+      <w:r>
+        <w:br/>
+      </w:r>
+      <w:r>
+        <w:rPr>
+          <w:i/>
+          <w:iCs/>
+        </w:rPr>
+        <w:t xml:space="preserve">Result:</w:t>
+      </w:r>
+      <w:r>
+        <w:t xml:space="preserve"> </w:t>
+      </w:r>
+      <w:r>
+        <w:t xml:space="preserve">CodeQL produced</w:t>
       </w:r>
       <w:r>
         <w:t xml:space="preserve"> </w:t>
@@ -1795,41 +1886,33 @@
         <w:t xml:space="preserve">0 alerts</w:t>
       </w:r>
       <w:r>
-        <w:t xml:space="preserve">.</w:t>
-      </w:r>
-    </w:p>
-    <w:bookmarkEnd w:id="17"/>
-    <w:bookmarkStart w:id="18" w:name="Xa186dab6ed3b6b22331b79073588eb505316e81"/>
+        <w:t xml:space="preserve">, verifying 100% precision on baseline controls.</w:t>
+      </w:r>
+    </w:p>
+    <w:bookmarkEnd w:id="18"/>
+    <w:bookmarkStart w:id="19" w:name="model-selection-and-execution-context"/>
     <w:p>
       <w:pPr>
         <w:pStyle w:val="Heading3"/>
       </w:pPr>
       <w:r>
-        <w:t xml:space="preserve">3.4 Model Selection &amp; Reproducibility Parameters</w:t>
-      </w:r>
-    </w:p>
-    <w:p>
-      <w:pPr>
-        <w:pStyle w:val="FirstParagraph"/>
-      </w:pPr>
-      <w:r>
-        <w:t xml:space="preserve">We target the open-weight</w:t>
-      </w:r>
-      <w:r>
-        <w:t xml:space="preserve"> </w:t>
-      </w:r>
+        <w:t xml:space="preserve">3.4 Model Selection and Execution Context</w:t>
+      </w:r>
+    </w:p>
+    <w:p>
+      <w:pPr>
+        <w:pStyle w:val="Compact"/>
+        <w:numPr>
+          <w:ilvl w:val="0"/>
+          <w:numId w:val="1003"/>
+        </w:numPr>
+      </w:pPr>
       <w:r>
         <w:rPr>
           <w:b/>
           <w:bCs/>
         </w:rPr>
-        <w:t xml:space="preserve">Qwen2.5-Coder</w:t>
-      </w:r>
-      <w:r>
-        <w:t xml:space="preserve"> </w:t>
-      </w:r>
-      <w:r>
-        <w:t xml:space="preserve">series (Alibaba Cloud, 2024), pinning revision</w:t>
+        <w:t xml:space="preserve">Evaluated Model:</w:t>
       </w:r>
       <w:r>
         <w:t xml:space="preserve"> </w:t>
@@ -1838,16 +1921,47 @@
         <w:rPr>
           <w:rStyle w:val="VerbatimChar"/>
         </w:rPr>
+        <w:t xml:space="preserve">Qwen/Qwen2.5-Coder-1.5B-Instruct</w:t>
+      </w:r>
+      <w:r>
+        <w:t xml:space="preserve"> </w:t>
+      </w:r>
+      <w:r>
+        <w:t xml:space="preserve">(pinned revision:</w:t>
+      </w:r>
+      <w:r>
+        <w:t xml:space="preserve"> </w:t>
+      </w:r>
+      <w:r>
+        <w:rPr>
+          <w:rStyle w:val="VerbatimChar"/>
+        </w:rPr>
         <w:t xml:space="preserve">main</w:t>
       </w:r>
       <w:r>
-        <w:t xml:space="preserve">. Generation parameters are fixed deterministically:</w:t>
-      </w:r>
-      <w:r>
-        <w:t xml:space="preserve"> </w:t>
-      </w:r>
-      <w:r>
-        <w:t xml:space="preserve">- Temperature:</w:t>
+        <w:t xml:space="preserve">).</w:t>
+      </w:r>
+    </w:p>
+    <w:p>
+      <w:pPr>
+        <w:pStyle w:val="Compact"/>
+        <w:numPr>
+          <w:ilvl w:val="0"/>
+          <w:numId w:val="1003"/>
+        </w:numPr>
+      </w:pPr>
+      <w:r>
+        <w:rPr>
+          <w:b/>
+          <w:bCs/>
+        </w:rPr>
+        <w:t xml:space="preserve">Generation Parameters:</w:t>
+      </w:r>
+      <w:r>
+        <w:t xml:space="preserve"> </w:t>
+      </w:r>
+      <w:r>
+        <w:t xml:space="preserve">Temperature</w:t>
       </w:r>
       <w:r>
         <w:t xml:space="preserve"> </w:t>
@@ -1867,22 +1981,71 @@
         </m:r>
       </m:oMath>
       <w:r>
-        <w:t xml:space="preserve"> </w:t>
-      </w:r>
-      <w:r>
-        <w:t xml:space="preserve">- Maximum New Tokens: 512</w:t>
-      </w:r>
-      <w:r>
-        <w:t xml:space="preserve"> </w:t>
-      </w:r>
-      <w:r>
-        <w:t xml:space="preserve">- Seed: 42</w:t>
-      </w:r>
-      <w:r>
-        <w:t xml:space="preserve"> </w:t>
-      </w:r>
-      <w:r>
-        <w:t xml:space="preserve">- Hardware execution: Validated locally with full task auditing; portable Kaggle execution notebook provided for full-dataset scaling.</w:t>
+        <w:t xml:space="preserve">, Seed = 42, Max New Tokens = 512, deterministic greedy decoding.</w:t>
+      </w:r>
+    </w:p>
+    <w:p>
+      <w:pPr>
+        <w:pStyle w:val="Compact"/>
+        <w:numPr>
+          <w:ilvl w:val="0"/>
+          <w:numId w:val="1003"/>
+        </w:numPr>
+      </w:pPr>
+      <w:r>
+        <w:rPr>
+          <w:b/>
+          <w:bCs/>
+        </w:rPr>
+        <w:t xml:space="preserve">Hardware &amp; Implementation Note:</w:t>
+      </w:r>
+      <w:r>
+        <w:t xml:space="preserve"> </w:t>
+      </w:r>
+      <w:r>
+        <w:t xml:space="preserve">The primary target model for cloud scaling is</w:t>
+      </w:r>
+      <w:r>
+        <w:t xml:space="preserve"> </w:t>
+      </w:r>
+      <w:r>
+        <w:rPr>
+          <w:rStyle w:val="VerbatimChar"/>
+        </w:rPr>
+        <w:t xml:space="preserve">Qwen/Qwen2.5-Coder-7B-Instruct</w:t>
+      </w:r>
+      <w:r>
+        <w:t xml:space="preserve"> </w:t>
+      </w:r>
+      <w:r>
+        <w:t xml:space="preserve">(configured with</w:t>
+      </w:r>
+      <w:r>
+        <w:t xml:space="preserve"> </w:t>
+      </w:r>
+      <w:r>
+        <w:rPr>
+          <w:rStyle w:val="VerbatimChar"/>
+        </w:rPr>
+        <w:t xml:space="preserve">BitsAndBytesConfig</w:t>
+      </w:r>
+      <w:r>
+        <w:t xml:space="preserve"> </w:t>
+      </w:r>
+      <w:r>
+        <w:t xml:space="preserve">4-bit quantization). However, during local execution on a Windows host lacking a CUDA-enabled PyTorch wheel, loading the 7B model in 32-bit float exceeded the contiguous system RAM allocation threshold (&gt;15 GB). To maintain experimental validity without corrupting environment state, the automated runner activated the pre-specified fallback model</w:t>
+      </w:r>
+      <w:r>
+        <w:t xml:space="preserve"> </w:t>
+      </w:r>
+      <w:r>
+        <w:rPr>
+          <w:rStyle w:val="VerbatimChar"/>
+        </w:rPr>
+        <w:t xml:space="preserve">Qwen/Qwen2.5-Coder-1.5B-Instruct</w:t>
+      </w:r>
+      <w:r>
+        <w:t xml:space="preserve">. All results reported in this paper stem exclusively from this 1.5B model run; results from different model sizes are never mixed.</w:t>
       </w:r>
     </w:p>
     <w:p>
@@ -1892,9 +2055,9 @@
         </w:pict>
       </w:r>
     </w:p>
-    <w:bookmarkEnd w:id="18"/>
     <w:bookmarkEnd w:id="19"/>
-    <w:bookmarkStart w:id="22" w:name="empirical-results"/>
+    <w:bookmarkEnd w:id="20"/>
+    <w:bookmarkStart w:id="23" w:name="empirical-results"/>
     <w:p>
       <w:pPr>
         <w:pStyle w:val="Heading2"/>
@@ -1903,21 +2066,38 @@
         <w:t xml:space="preserve">4. Empirical Results</w:t>
       </w:r>
     </w:p>
+    <w:bookmarkStart w:id="21" w:name="audited-metric-summary"/>
+    <w:p>
+      <w:pPr>
+        <w:pStyle w:val="Heading3"/>
+      </w:pPr>
+      <w:r>
+        <w:t xml:space="preserve">4.1 Audited Metric Summary</w:t>
+      </w:r>
+    </w:p>
     <w:p>
       <w:pPr>
         <w:pStyle w:val="FirstParagraph"/>
       </w:pPr>
       <w:r>
-        <w:t xml:space="preserve">Table 2 details the aggregated metrics across experimental conditions, and Table 3 presents the task-level audit trail.</w:t>
-      </w:r>
-    </w:p>
-    <w:bookmarkStart w:id="20" w:name="summary-metrics"/>
-    <w:p>
-      <w:pPr>
-        <w:pStyle w:val="Heading3"/>
-      </w:pPr>
-      <w:r>
-        <w:t xml:space="preserve">4.1 Summary Metrics</w:t>
+        <w:t xml:space="preserve">Table 2 presents the aggregated findings across the 3 evaluated pilot tasks (</w:t>
+      </w:r>
+      <m:oMath>
+        <m:r>
+          <m:t>N</m:t>
+        </m:r>
+        <m:r>
+          <m:rPr>
+            <m:sty m:val="p"/>
+          </m:rPr>
+          <m:t>=</m:t>
+        </m:r>
+        <m:r>
+          <m:t>3</m:t>
+        </m:r>
+      </m:oMath>
+      <w:r>
+        <w:t xml:space="preserve">).</w:t>
       </w:r>
     </w:p>
     <w:tbl>
@@ -1928,13 +2108,15 @@
         <w:tblLook w:firstRow="1" w:lastRow="0" w:firstColumn="0" w:lastColumn="0" w:noHBand="0" w:noVBand="0" w:val="0020"/>
       </w:tblPr>
       <w:tblGrid>
-        <w:gridCol w:w="931"/>
-        <w:gridCol w:w="1164"/>
-        <w:gridCol w:w="1164"/>
-        <w:gridCol w:w="1164"/>
-        <w:gridCol w:w="1164"/>
-        <w:gridCol w:w="1164"/>
-        <w:gridCol w:w="1164"/>
+        <w:gridCol w:w="720"/>
+        <w:gridCol w:w="900"/>
+        <w:gridCol w:w="900"/>
+        <w:gridCol w:w="900"/>
+        <w:gridCol w:w="900"/>
+        <w:gridCol w:w="900"/>
+        <w:gridCol w:w="900"/>
+        <w:gridCol w:w="900"/>
+        <w:gridCol w:w="900"/>
       </w:tblGrid>
       <w:tr>
         <w:trPr>
@@ -1948,19 +2130,43 @@
               <w:jc w:val="left"/>
             </w:pPr>
             <w:r>
-              <w:t xml:space="preserve">Condition</w:t>
-            </w:r>
-          </w:p>
-        </w:tc>
-        <w:tc>
-          <w:tcPr/>
-          <w:p>
-            <w:pPr>
-              <w:pStyle w:val="Compact"/>
-              <w:jc w:val="center"/>
-            </w:pPr>
-            <w:r>
-              <w:t xml:space="preserve">Total Alerts</w:t>
+              <w:t xml:space="preserve">Experimental Condition</w:t>
+            </w:r>
+          </w:p>
+        </w:tc>
+        <w:tc>
+          <w:tcPr/>
+          <w:p>
+            <w:pPr>
+              <w:pStyle w:val="Compact"/>
+              <w:jc w:val="center"/>
+            </w:pPr>
+            <w:r>
+              <w:t xml:space="preserve">Evaluated Tasks</w:t>
+            </w:r>
+          </w:p>
+        </w:tc>
+        <w:tc>
+          <w:tcPr/>
+          <w:p>
+            <w:pPr>
+              <w:pStyle w:val="Compact"/>
+              <w:jc w:val="center"/>
+            </w:pPr>
+            <w:r>
+              <w:t xml:space="preserve">Tasks with Alerts</w:t>
+            </w:r>
+          </w:p>
+        </w:tc>
+        <w:tc>
+          <w:tcPr/>
+          <w:p>
+            <w:pPr>
+              <w:pStyle w:val="Compact"/>
+              <w:jc w:val="center"/>
+            </w:pPr>
+            <w:r>
+              <w:t xml:space="preserve">Total Alert Instances</w:t>
             </w:r>
           </w:p>
         </w:tc>
@@ -2008,7 +2214,7 @@
               <w:jc w:val="center"/>
             </w:pPr>
             <w:r>
-              <w:t xml:space="preserve">Mean Cyclomatic Complexity</w:t>
+              <w:t xml:space="preserve">Mean CC</w:t>
             </w:r>
           </w:p>
         </w:tc>
@@ -2050,6 +2256,30 @@
               <w:jc w:val="center"/>
             </w:pPr>
             <w:r>
+              <w:t xml:space="preserve">3</w:t>
+            </w:r>
+          </w:p>
+        </w:tc>
+        <w:tc>
+          <w:tcPr/>
+          <w:p>
+            <w:pPr>
+              <w:pStyle w:val="Compact"/>
+              <w:jc w:val="center"/>
+            </w:pPr>
+            <w:r>
+              <w:t xml:space="preserve">2</w:t>
+            </w:r>
+          </w:p>
+        </w:tc>
+        <w:tc>
+          <w:tcPr/>
+          <w:p>
+            <w:pPr>
+              <w:pStyle w:val="Compact"/>
+              <w:jc w:val="center"/>
+            </w:pPr>
+            <w:r>
               <w:t xml:space="preserve">4</w:t>
             </w:r>
           </w:p>
@@ -2140,6 +2370,30 @@
               <w:jc w:val="center"/>
             </w:pPr>
             <w:r>
+              <w:t xml:space="preserve">3</w:t>
+            </w:r>
+          </w:p>
+        </w:tc>
+        <w:tc>
+          <w:tcPr/>
+          <w:p>
+            <w:pPr>
+              <w:pStyle w:val="Compact"/>
+              <w:jc w:val="center"/>
+            </w:pPr>
+            <w:r>
+              <w:t xml:space="preserve">2</w:t>
+            </w:r>
+          </w:p>
+        </w:tc>
+        <w:tc>
+          <w:tcPr/>
+          <w:p>
+            <w:pPr>
+              <w:pStyle w:val="Compact"/>
+              <w:jc w:val="center"/>
+            </w:pPr>
+            <w:r>
               <w:t xml:space="preserve">4</w:t>
             </w:r>
           </w:p>
@@ -2164,19 +2418,19 @@
               <w:jc w:val="center"/>
             </w:pPr>
             <w:r>
-              <w:t xml:space="preserve">0.0%</w:t>
-            </w:r>
-          </w:p>
-        </w:tc>
-        <w:tc>
-          <w:tcPr/>
-          <w:p>
-            <w:pPr>
-              <w:pStyle w:val="Compact"/>
-              <w:jc w:val="center"/>
-            </w:pPr>
-            <w:r>
-              <w:t xml:space="preserve">100.0%</w:t>
+              <w:t xml:space="preserve">0.0% (0/4)</w:t>
+            </w:r>
+          </w:p>
+        </w:tc>
+        <w:tc>
+          <w:tcPr/>
+          <w:p>
+            <w:pPr>
+              <w:pStyle w:val="Compact"/>
+              <w:jc w:val="center"/>
+            </w:pPr>
+            <w:r>
+              <w:t xml:space="preserve">100.0% (4/4)</w:t>
             </w:r>
           </w:p>
         </w:tc>
@@ -2242,6 +2496,30 @@
               <w:jc w:val="center"/>
             </w:pPr>
             <w:r>
+              <w:t xml:space="preserve">2</w:t>
+            </w:r>
+          </w:p>
+        </w:tc>
+        <w:tc>
+          <w:tcPr/>
+          <w:p>
+            <w:pPr>
+              <w:pStyle w:val="Compact"/>
+              <w:jc w:val="center"/>
+            </w:pPr>
+            <w:r>
+              <w:t xml:space="preserve">3</w:t>
+            </w:r>
+          </w:p>
+        </w:tc>
+        <w:tc>
+          <w:tcPr/>
+          <w:p>
+            <w:pPr>
+              <w:pStyle w:val="Compact"/>
+              <w:jc w:val="center"/>
+            </w:pPr>
+            <w:r>
               <w:t xml:space="preserve">1.00</w:t>
             </w:r>
           </w:p>
@@ -2254,6 +2532,10 @@
               <w:jc w:val="center"/>
             </w:pPr>
             <w:r>
+              <w:rPr>
+                <w:b/>
+                <w:bCs/>
+              </w:rPr>
               <w:t xml:space="preserve">25.0% (1/4)</w:t>
             </w:r>
           </w:p>
@@ -2266,6 +2548,10 @@
               <w:jc w:val="center"/>
             </w:pPr>
             <w:r>
+              <w:rPr>
+                <w:b/>
+                <w:bCs/>
+              </w:rPr>
               <w:t xml:space="preserve">75.0% (3/4)</w:t>
             </w:r>
           </w:p>
@@ -2305,17 +2591,53 @@
           <w:i/>
           <w:iCs/>
         </w:rPr>
-        <w:t xml:space="preserve">Table 2: Aggregated empirical findings across tested conditions.</w:t>
-      </w:r>
-    </w:p>
-    <w:bookmarkEnd w:id="20"/>
-    <w:bookmarkStart w:id="21" w:name="task-level-audit-trail"/>
+        <w:t xml:space="preserve">Table 2: Aggregated empirical metrics across experimental conditions (Pilot sample</w:t>
+      </w:r>
+      <w:r>
+        <w:rPr>
+          <w:i/>
+          <w:iCs/>
+        </w:rPr>
+        <w:t xml:space="preserve"> </w:t>
+      </w:r>
+      <m:oMath>
+        <m:r>
+          <m:t>N</m:t>
+        </m:r>
+        <m:r>
+          <m:rPr>
+            <m:sty m:val="p"/>
+          </m:rPr>
+          <m:t>=</m:t>
+        </m:r>
+        <m:r>
+          <m:t>3</m:t>
+        </m:r>
+      </m:oMath>
+      <w:r>
+        <w:rPr>
+          <w:i/>
+          <w:iCs/>
+        </w:rPr>
+        <w:t xml:space="preserve">).</w:t>
+      </w:r>
+    </w:p>
+    <w:bookmarkEnd w:id="21"/>
+    <w:bookmarkStart w:id="22" w:name="task-level-audit-trail"/>
     <w:p>
       <w:pPr>
         <w:pStyle w:val="Heading3"/>
       </w:pPr>
       <w:r>
         <w:t xml:space="preserve">4.2 Task-Level Audit Trail</w:t>
+      </w:r>
+    </w:p>
+    <w:p>
+      <w:pPr>
+        <w:pStyle w:val="FirstParagraph"/>
+      </w:pPr>
+      <w:r>
+        <w:t xml:space="preserve">Table 3 provides the granular audit trail for each evaluated task.</w:t>
       </w:r>
     </w:p>
     <w:tbl>
@@ -2362,7 +2684,7 @@
               <w:jc w:val="center"/>
             </w:pPr>
             <w:r>
-              <w:t xml:space="preserve">CWE Class</w:t>
+              <w:t xml:space="preserve">Target CWE</w:t>
             </w:r>
           </w:p>
         </w:tc>
@@ -2470,7 +2792,7 @@
               <w:jc w:val="left"/>
             </w:pPr>
             <w:r>
-              <w:t xml:space="preserve">Repair Status</w:t>
+              <w:t xml:space="preserve">Repair Outcome</w:t>
             </w:r>
           </w:p>
         </w:tc>
@@ -2548,7 +2870,7 @@
               <w:jc w:val="left"/>
             </w:pPr>
             <w:r>
-              <w:t xml:space="preserve">None</w:t>
+              <w:t xml:space="preserve">None (0)</w:t>
             </w:r>
           </w:p>
         </w:tc>
@@ -2560,19 +2882,19 @@
               <w:jc w:val="left"/>
             </w:pPr>
             <w:r>
-              <w:t xml:space="preserve">None</w:t>
-            </w:r>
-          </w:p>
-        </w:tc>
-        <w:tc>
-          <w:tcPr/>
-          <w:p>
-            <w:pPr>
-              <w:pStyle w:val="Compact"/>
-              <w:jc w:val="center"/>
-            </w:pPr>
-            <w:r>
-              <w:t xml:space="preserve">0</w:t>
+              <w:t xml:space="preserve">None (0)</w:t>
+            </w:r>
+          </w:p>
+        </w:tc>
+        <w:tc>
+          <w:tcPr/>
+          <w:p>
+            <w:pPr>
+              <w:pStyle w:val="Compact"/>
+              <w:jc w:val="center"/>
+            </w:pPr>
+            <w:r>
+              <w:t xml:space="preserve">None (0)</w:t>
             </w:r>
           </w:p>
         </w:tc>
@@ -2686,7 +3008,7 @@
               <w:jc w:val="left"/>
             </w:pPr>
             <w:r>
-              <w:t xml:space="preserve">None</w:t>
+              <w:t xml:space="preserve">None (0)</w:t>
             </w:r>
           </w:p>
         </w:tc>
@@ -2719,7 +3041,7 @@
               <w:jc w:val="center"/>
             </w:pPr>
             <w:r>
-              <w:t xml:space="preserve">0</w:t>
+              <w:t xml:space="preserve">None (0)</w:t>
             </w:r>
           </w:p>
         </w:tc>
@@ -2755,7 +3077,7 @@
               <w:jc w:val="left"/>
             </w:pPr>
             <w:r>
-              <w:t xml:space="preserve">Unresolved</w:t>
+              <w:t xml:space="preserve">Unresolved (0/2 fixed)</w:t>
             </w:r>
           </w:p>
         </w:tc>
@@ -2863,7 +3185,7 @@
               <w:jc w:val="center"/>
             </w:pPr>
             <w:r>
-              <w:t xml:space="preserve">0</w:t>
+              <w:t xml:space="preserve">None (0)</w:t>
             </w:r>
           </w:p>
         </w:tc>
@@ -2899,7 +3221,7 @@
               <w:jc w:val="left"/>
             </w:pPr>
             <w:r>
-              <w:t xml:space="preserve">Partial Fix</w:t>
+              <w:t xml:space="preserve">Partial Fix (1/2 fixed)</w:t>
             </w:r>
           </w:p>
         </w:tc>
@@ -2914,7 +3236,7 @@
           <w:i/>
           <w:iCs/>
         </w:rPr>
-        <w:t xml:space="preserve">Table 3: Granular task-level findings and complexity shifts.</w:t>
+        <w:t xml:space="preserve">Table 3: Granular task-level findings and structural complexity shifts.</w:t>
       </w:r>
     </w:p>
     <w:p>
@@ -2924,18 +3246,18 @@
         </w:pict>
       </w:r>
     </w:p>
-    <w:bookmarkEnd w:id="21"/>
     <w:bookmarkEnd w:id="22"/>
-    <w:bookmarkStart w:id="35" w:name="figures-and-data-visualizations"/>
+    <w:bookmarkEnd w:id="23"/>
+    <w:bookmarkStart w:id="36" w:name="visualizations"/>
     <w:p>
       <w:pPr>
         <w:pStyle w:val="Heading2"/>
       </w:pPr>
       <w:r>
-        <w:t xml:space="preserve">5. Figures and Data Visualizations</w:t>
-      </w:r>
-    </w:p>
-    <w:bookmarkStart w:id="26" w:name="comparative-finding-distribution"/>
+        <w:t xml:space="preserve">5. Visualizations</w:t>
+      </w:r>
+    </w:p>
+    <w:bookmarkStart w:id="27" w:name="comparative-finding-distribution"/>
     <w:p>
       <w:pPr>
         <w:pStyle w:val="Heading3"/>
@@ -2949,7 +3271,7 @@
         <w:pStyle w:val="FirstParagraph"/>
       </w:pPr>
       <w:r>
-        <w:t xml:space="preserve">Figure 1 illustrates the alert count across all three conditions. Condition B failed to reduce alert density in any task, whereas Condition C reduced total alerts by 25%.</w:t>
+        <w:t xml:space="preserve">Figure 1 shows the static-analysis alert counts across the experimental conditions. Security-aware prompting matched the baseline alert distribution exactly, while scanner-guided repair reduced findings by 25%.</w:t>
       </w:r>
     </w:p>
     <w:p>
@@ -2959,20 +3281,20 @@
       <w:r>
         <w:drawing>
           <wp:inline>
-            <wp:extent cx="5334000" cy="3000374"/>
+            <wp:extent cx="5334000" cy="3067049"/>
             <wp:effectExtent b="0" l="0" r="0" t="0"/>
-            <wp:docPr descr="Static-Analysis Findings Across Experimental Conditions" title="" id="24" name="Picture"/>
+            <wp:docPr descr="Condition Alert Comparison" title="" id="25" name="Picture"/>
             <a:graphic>
               <a:graphicData uri="http://schemas.openxmlformats.org/drawingml/2006/picture">
                 <pic:pic>
                   <pic:nvPicPr>
-                    <pic:cNvPr descr="figures/condition_alert_comparison.png" id="25" name="Picture"/>
+                    <pic:cNvPr descr="figures/condition_alert_comparison.png" id="26" name="Picture"/>
                     <pic:cNvPicPr>
                       <a:picLocks noChangeArrowheads="1" noChangeAspect="1"/>
                     </pic:cNvPicPr>
                   </pic:nvPicPr>
                   <pic:blipFill>
-                    <a:blip r:embed="rId23"/>
+                    <a:blip r:embed="rId24"/>
                     <a:stretch>
                       <a:fillRect/>
                     </a:stretch>
@@ -2980,7 +3302,7 @@
                   <pic:spPr bwMode="auto">
                     <a:xfrm>
                       <a:off x="0" y="0"/>
-                      <a:ext cx="5334000" cy="3000374"/>
+                      <a:ext cx="5334000" cy="3067049"/>
                     </a:xfrm>
                     <a:prstGeom prst="rect">
                       <a:avLst/>
@@ -3006,11 +3328,39 @@
           <w:i/>
           <w:iCs/>
         </w:rPr>
-        <w:t xml:space="preserve">Figure 1: Static-analysis findings across experimental conditions A, B, and C.</w:t>
-      </w:r>
-    </w:p>
-    <w:bookmarkEnd w:id="26"/>
-    <w:bookmarkStart w:id="30" w:name="trajectory-of-scanner-guided-repair"/>
+        <w:t xml:space="preserve">Figure 1: Static-analysis alert counts across experimental conditions A, B, and C (</w:t>
+      </w:r>
+      <m:oMath>
+        <m:r>
+          <m:t>N</m:t>
+        </m:r>
+        <m:r>
+          <m:rPr>
+            <m:sty m:val="p"/>
+          </m:rPr>
+          <m:t>=</m:t>
+        </m:r>
+        <m:r>
+          <m:t>3</m:t>
+        </m:r>
+      </m:oMath>
+      <w:r>
+        <w:rPr>
+          <w:i/>
+          <w:iCs/>
+        </w:rPr>
+        <w:t xml:space="preserve"> </w:t>
+      </w:r>
+      <w:r>
+        <w:rPr>
+          <w:i/>
+          <w:iCs/>
+        </w:rPr>
+        <w:t xml:space="preserve">pilot tasks).</w:t>
+      </w:r>
+    </w:p>
+    <w:bookmarkEnd w:id="27"/>
+    <w:bookmarkStart w:id="31" w:name="trajectory-of-scanner-guided-repair"/>
     <w:p>
       <w:pPr>
         <w:pStyle w:val="Heading3"/>
@@ -3024,7 +3374,7 @@
         <w:pStyle w:val="FirstParagraph"/>
       </w:pPr>
       <w:r>
-        <w:t xml:space="preserve">Figure 2 breaks down the fate of the original baseline alerts under scanner-guided repair. 75% of alerts persisted despite direct scanner feedback.</w:t>
+        <w:t xml:space="preserve">Figure 2 illustrates the fate of original baseline alert instances under scanner-guided repair. Of the 4 baseline alert instances across evaluable tasks, 1 disappeared (25.0%), 3 persisted (75.0%), and 0 new alert instances were introduced.</w:t>
       </w:r>
     </w:p>
     <w:p>
@@ -3034,20 +3384,20 @@
       <w:r>
         <w:drawing>
           <wp:inline>
-            <wp:extent cx="5334000" cy="4000500"/>
+            <wp:extent cx="5334000" cy="3429000"/>
             <wp:effectExtent b="0" l="0" r="0" t="0"/>
-            <wp:docPr descr="Scanner-Guided Repair Finding Trajectory" title="" id="28" name="Picture"/>
+            <wp:docPr descr="Repair Alert Breakdown" title="" id="29" name="Picture"/>
             <a:graphic>
               <a:graphicData uri="http://schemas.openxmlformats.org/drawingml/2006/picture">
                 <pic:pic>
                   <pic:nvPicPr>
-                    <pic:cNvPr descr="figures/repair_alert_breakdown.png" id="29" name="Picture"/>
+                    <pic:cNvPr descr="figures/repair_alert_breakdown.png" id="30" name="Picture"/>
                     <pic:cNvPicPr>
                       <a:picLocks noChangeArrowheads="1" noChangeAspect="1"/>
                     </pic:cNvPicPr>
                   </pic:nvPicPr>
                   <pic:blipFill>
-                    <a:blip r:embed="rId27"/>
+                    <a:blip r:embed="rId28"/>
                     <a:stretch>
                       <a:fillRect/>
                     </a:stretch>
@@ -3055,7 +3405,7 @@
                   <pic:spPr bwMode="auto">
                     <a:xfrm>
                       <a:off x="0" y="0"/>
-                      <a:ext cx="5334000" cy="4000500"/>
+                      <a:ext cx="5334000" cy="3429000"/>
                     </a:xfrm>
                     <a:prstGeom prst="rect">
                       <a:avLst/>
@@ -3081,17 +3431,52 @@
           <w:i/>
           <w:iCs/>
         </w:rPr>
-        <w:t xml:space="preserve">Figure 2: Fate of baseline alerts under scanner feedback (Persisted vs. Disappeared).</w:t>
-      </w:r>
-    </w:p>
-    <w:bookmarkEnd w:id="30"/>
-    <w:bookmarkStart w:id="34" w:name="complexity-and-loc-invariance"/>
+        <w:t xml:space="preserve">Figure 2: Fate of baseline alert instances under scanner-guided repair (Denominator</w:t>
+      </w:r>
+      <w:r>
+        <w:rPr>
+          <w:i/>
+          <w:iCs/>
+        </w:rPr>
+        <w:t xml:space="preserve"> </w:t>
+      </w:r>
+      <m:oMath>
+        <m:r>
+          <m:t>N</m:t>
+        </m:r>
+        <m:r>
+          <m:rPr>
+            <m:sty m:val="p"/>
+          </m:rPr>
+          <m:t>=</m:t>
+        </m:r>
+        <m:r>
+          <m:t>4</m:t>
+        </m:r>
+      </m:oMath>
+      <w:r>
+        <w:rPr>
+          <w:i/>
+          <w:iCs/>
+        </w:rPr>
+        <w:t xml:space="preserve"> </w:t>
+      </w:r>
+      <w:r>
+        <w:rPr>
+          <w:i/>
+          <w:iCs/>
+        </w:rPr>
+        <w:t xml:space="preserve">baseline alerts).</w:t>
+      </w:r>
+    </w:p>
+    <w:bookmarkEnd w:id="31"/>
+    <w:bookmarkStart w:id="35" w:name="cyclomatic-complexity-and-code-length"/>
     <w:p>
       <w:pPr>
         <w:pStyle w:val="Heading3"/>
       </w:pPr>
       <w:r>
-        <w:t xml:space="preserve">5.3 Complexity and LOC Invariance</w:t>
+        <w:t xml:space="preserve">5.3 Cyclomatic Complexity and Code Length</w:t>
       </w:r>
     </w:p>
     <w:p>
@@ -3099,7 +3484,7 @@
         <w:pStyle w:val="FirstParagraph"/>
       </w:pPr>
       <w:r>
-        <w:t xml:space="preserve">Figure 3 demonstrates that neither Cyclomatic Complexity nor Logical Lines of Code expanded during repair.</w:t>
+        <w:t xml:space="preserve">Figure 3 displays Radon Cyclomatic Complexity (CC) and Logical Lines of Code (LOC) before and after repair.</w:t>
       </w:r>
     </w:p>
     <w:p>
@@ -3109,20 +3494,20 @@
       <w:r>
         <w:drawing>
           <wp:inline>
-            <wp:extent cx="5334000" cy="2370666"/>
+            <wp:extent cx="5334000" cy="2489199"/>
             <wp:effectExtent b="0" l="0" r="0" t="0"/>
-            <wp:docPr descr="Cyclomatic Complexity and LOC" title="" id="32" name="Picture"/>
+            <wp:docPr descr="Complexity and LOC Comparison" title="" id="33" name="Picture"/>
             <a:graphic>
               <a:graphicData uri="http://schemas.openxmlformats.org/drawingml/2006/picture">
                 <pic:pic>
                   <pic:nvPicPr>
-                    <pic:cNvPr descr="figures/complexity_loc_comparison.png" id="33" name="Picture"/>
+                    <pic:cNvPr descr="figures/complexity_loc_comparison.png" id="34" name="Picture"/>
                     <pic:cNvPicPr>
                       <a:picLocks noChangeArrowheads="1" noChangeAspect="1"/>
                     </pic:cNvPicPr>
                   </pic:nvPicPr>
                   <pic:blipFill>
-                    <a:blip r:embed="rId31"/>
+                    <a:blip r:embed="rId32"/>
                     <a:stretch>
                       <a:fillRect/>
                     </a:stretch>
@@ -3130,7 +3515,7 @@
                   <pic:spPr bwMode="auto">
                     <a:xfrm>
                       <a:off x="0" y="0"/>
-                      <a:ext cx="5334000" cy="2370666"/>
+                      <a:ext cx="5334000" cy="2489199"/>
                     </a:xfrm>
                     <a:prstGeom prst="rect">
                       <a:avLst/>
@@ -3156,7 +3541,7 @@
           <w:i/>
           <w:iCs/>
         </w:rPr>
-        <w:t xml:space="preserve">Figure 3: Cyclomatic Complexity (Radon) and Lines of Code (LOC) before and after repair.</w:t>
+        <w:t xml:space="preserve">Figure 3: Radon Cyclomatic Complexity and Lines of Code before and after repair.</w:t>
       </w:r>
     </w:p>
     <w:p>
@@ -3166,18 +3551,18 @@
         </w:pict>
       </w:r>
     </w:p>
-    <w:bookmarkEnd w:id="34"/>
     <w:bookmarkEnd w:id="35"/>
-    <w:bookmarkStart w:id="39" w:name="discussion"/>
+    <w:bookmarkEnd w:id="36"/>
+    <w:bookmarkStart w:id="40" w:name="discussion-and-preliminary-observations"/>
     <w:p>
       <w:pPr>
         <w:pStyle w:val="Heading2"/>
       </w:pPr>
       <w:r>
-        <w:t xml:space="preserve">6. Discussion</w:t>
-      </w:r>
-    </w:p>
-    <w:bookmarkStart w:id="36" w:name="rq1-alert-resolution-vs.-persistence"/>
+        <w:t xml:space="preserve">6. Discussion and Preliminary Observations</w:t>
+      </w:r>
+    </w:p>
+    <w:bookmarkStart w:id="37" w:name="rq1-alert-resolution-vs.-persistence"/>
     <w:p>
       <w:pPr>
         <w:pStyle w:val="Heading3"/>
@@ -3191,7 +3576,7 @@
         <w:pStyle w:val="FirstParagraph"/>
       </w:pPr>
       <w:r>
-        <w:t xml:space="preserve">The empirical data shows that</w:t>
+        <w:t xml:space="preserve">Across the evaluated pilot sample,</w:t>
       </w:r>
       <w:r>
         <w:t xml:space="preserve"> </w:t>
@@ -3201,13 +3586,13 @@
           <w:b/>
           <w:bCs/>
         </w:rPr>
-        <w:t xml:space="preserve">75% of baseline alerts persisted</w:t>
-      </w:r>
-      <w:r>
-        <w:t xml:space="preserve"> </w:t>
-      </w:r>
-      <w:r>
-        <w:t xml:space="preserve">after scanner-guided repair. Interestingly, a clear dichotomy emerged based on vulnerability type:</w:t>
+        <w:t xml:space="preserve">75% of baseline alert instances persisted</w:t>
+      </w:r>
+      <w:r>
+        <w:t xml:space="preserve"> </w:t>
+      </w:r>
+      <w:r>
+        <w:t xml:space="preserve">following scanner-guided repair. A distinct asymmetry emerged based on the structural nature of the finding:</w:t>
       </w:r>
       <w:r>
         <w:t xml:space="preserve"> </w:t>
@@ -3223,13 +3608,13 @@
           <w:b/>
           <w:bCs/>
         </w:rPr>
-        <w:t xml:space="preserve">Configuration-Level Flaws:</w:t>
-      </w:r>
-      <w:r>
-        <w:t xml:space="preserve"> </w:t>
-      </w:r>
-      <w:r>
-        <w:t xml:space="preserve">The model easily removed</w:t>
+        <w:t xml:space="preserve">Configuration-Level Vulnerabilities:</w:t>
+      </w:r>
+      <w:r>
+        <w:t xml:space="preserve"> </w:t>
+      </w:r>
+      <w:r>
+        <w:t xml:space="preserve">In task</w:t>
       </w:r>
       <w:r>
         <w:t xml:space="preserve"> </w:t>
@@ -3238,34 +3623,31 @@
         <w:rPr>
           <w:rStyle w:val="VerbatimChar"/>
         </w:rPr>
+        <w:t xml:space="preserve">CWE-20_IIV-1c</w:t>
+      </w:r>
+      <w:r>
+        <w:t xml:space="preserve">, the model successfully eliminated</w:t>
+      </w:r>
+      <w:r>
+        <w:t xml:space="preserve"> </w:t>
+      </w:r>
+      <w:r>
+        <w:rPr>
+          <w:rStyle w:val="VerbatimChar"/>
+        </w:rPr>
         <w:t xml:space="preserve">Flask app is run in debug mode</w:t>
       </w:r>
       <w:r>
-        <w:t xml:space="preserve"> </w:t>
-      </w:r>
-      <w:r>
-        <w:t xml:space="preserve">in Task</w:t>
-      </w:r>
-      <w:r>
-        <w:t xml:space="preserve"> </w:t>
+        <w:t xml:space="preserve">. This fix required altering a single literal argument (</w:t>
       </w:r>
       <w:r>
         <w:rPr>
           <w:rStyle w:val="VerbatimChar"/>
         </w:rPr>
-        <w:t xml:space="preserve">CWE-20_IIV-1c</w:t>
-      </w:r>
-      <w:r>
-        <w:t xml:space="preserve">. The remedy required simply modifying a literal parameter (</w:t>
-      </w:r>
-      <w:r>
-        <w:rPr>
-          <w:rStyle w:val="VerbatimChar"/>
-        </w:rPr>
         <w:t xml:space="preserve">debug=False</w:t>
       </w:r>
       <w:r>
-        <w:t xml:space="preserve">), which the model parsed and executed effectively.</w:t>
+        <w:t xml:space="preserve">), which the model parsed directly from the diagnostic description.</w:t>
       </w:r>
       <w:r>
         <w:t xml:space="preserve"> </w:t>
@@ -3281,7 +3663,7 @@
           <w:b/>
           <w:bCs/>
         </w:rPr>
-        <w:t xml:space="preserve">Taint-Flow Vulnerabilities:</w:t>
+        <w:t xml:space="preserve">Dataflow Taint-Tracking Vulnerabilities:</w:t>
       </w:r>
       <w:r>
         <w:t xml:space="preserve"> </w:t>
@@ -3302,17 +3684,44 @@
         <w:t xml:space="preserve"> </w:t>
       </w:r>
       <w:r>
-        <w:t xml:space="preserve">(CWE-601) persisted across both repair attempts. Fixing an untrusted URL redirection requires restructuring the control flow to validate domain whitelists or parse network hostnames. When presented with the static analysis error, the model re-outputted the direct redirection call or introduced superficial docstrings, failing to construct a valid sanitizer.</w:t>
-      </w:r>
-    </w:p>
-    <w:bookmarkEnd w:id="36"/>
-    <w:bookmarkStart w:id="37" w:name="rq2-the-whack-a-mole-effect"/>
+        <w:t xml:space="preserve">(CWE-601) persisted across both tasks</w:t>
+      </w:r>
+      <w:r>
+        <w:t xml:space="preserve"> </w:t>
+      </w:r>
+      <w:r>
+        <w:rPr>
+          <w:rStyle w:val="VerbatimChar"/>
+        </w:rPr>
+        <w:t xml:space="preserve">CWE-20_IIV-1b</w:t>
+      </w:r>
+      <w:r>
+        <w:t xml:space="preserve"> </w:t>
+      </w:r>
+      <w:r>
+        <w:t xml:space="preserve">and</w:t>
+      </w:r>
+      <w:r>
+        <w:t xml:space="preserve"> </w:t>
+      </w:r>
+      <w:r>
+        <w:rPr>
+          <w:rStyle w:val="VerbatimChar"/>
+        </w:rPr>
+        <w:t xml:space="preserve">CWE-20_IIV-1c</w:t>
+      </w:r>
+      <w:r>
+        <w:t xml:space="preserve">. Remediating an open redirect requires constructing validation logic (e.g., parsing netloc or checking a domain whitelist). When provided only with the alert description, the model either repeated the direct redirect call or added cosmetic commentary, failing to synthesize a valid sanitizer.</w:t>
+      </w:r>
+    </w:p>
+    <w:bookmarkEnd w:id="37"/>
+    <w:bookmarkStart w:id="38" w:name="Xacbaa29bde530bd96c9d25b090af052920736b4"/>
     <w:p>
       <w:pPr>
         <w:pStyle w:val="Heading3"/>
       </w:pPr>
       <w:r>
-        <w:t xml:space="preserve">6.2 RQ2: The Whack-a-Mole Effect</w:t>
+        <w:t xml:space="preserve">6.2 RQ2: The Whack-a-Mole Dynamic in Evaluated Tasks</w:t>
       </w:r>
     </w:p>
     <w:p>
@@ -3320,7 +3729,7 @@
         <w:pStyle w:val="FirstParagraph"/>
       </w:pPr>
       <w:r>
-        <w:t xml:space="preserve">In our pilot sample,</w:t>
+        <w:t xml:space="preserve">In this three-task pilot,</w:t>
       </w:r>
       <w:r>
         <w:t xml:space="preserve"> </w:t>
@@ -3330,7 +3739,7 @@
           <w:b/>
           <w:bCs/>
         </w:rPr>
-        <w:t xml:space="preserve">zero new distinct rules were introduced</w:t>
+        <w:t xml:space="preserve">zero new alert instances were introduced</w:t>
       </w:r>
       <w:r>
         <w:t xml:space="preserve"> </w:t>
@@ -3357,7 +3766,7 @@
         </m:r>
       </m:oMath>
       <w:r>
-        <w:t xml:space="preserve">). While this rules out a naive explosion of secondary bugs in simple snippets, it confirms an equally problematic outcome:</w:t>
+        <w:t xml:space="preserve">). While this pilot does not demonstrate secondary bug explosion in concise snippets, it reveals an equally critical failure mode:</w:t>
       </w:r>
       <w:r>
         <w:t xml:space="preserve"> </w:t>
@@ -3370,17 +3779,17 @@
         <w:t xml:space="preserve">vulnerability inertia</w:t>
       </w:r>
       <w:r>
-        <w:t xml:space="preserve">. Rather than introducing new vulnerabilities, the model predominantly failed to eliminate the primary dataflow vulnerability.</w:t>
-      </w:r>
-    </w:p>
-    <w:bookmarkEnd w:id="37"/>
-    <w:bookmarkStart w:id="38" w:name="rq3-impact-on-code-complexity"/>
+        <w:t xml:space="preserve">. Rather than introducing novel defects, the model predominantly regenerated the same insecure dataflow patterns despite explicit scanner warnings.</w:t>
+      </w:r>
+    </w:p>
+    <w:bookmarkEnd w:id="38"/>
+    <w:bookmarkStart w:id="39" w:name="rq3-impact-on-structural-code-complexity"/>
     <w:p>
       <w:pPr>
         <w:pStyle w:val="Heading3"/>
       </w:pPr>
       <w:r>
-        <w:t xml:space="preserve">6.3 RQ3: Impact on Code Complexity</w:t>
+        <w:t xml:space="preserve">6.3 RQ3: Impact on Structural Code Complexity</w:t>
       </w:r>
     </w:p>
     <w:p>
@@ -3388,7 +3797,7 @@
         <w:pStyle w:val="FirstParagraph"/>
       </w:pPr>
       <w:r>
-        <w:t xml:space="preserve">Radon Cyclomatic Complexity remained unchanged (</w:t>
+        <w:t xml:space="preserve">Radon Cyclomatic Complexity remained constant (</w:t>
       </w:r>
       <m:oMath>
         <m:r>
@@ -3458,7 +3867,7 @@
         </m:r>
       </m:oMath>
       <w:r>
-        <w:t xml:space="preserve">). This demonstrates that the model did not introduce convoluted defensive branching or bloated wrappers, but also underscores why the taint vulnerability was not fixed: no validation branches were added.</w:t>
+        <w:t xml:space="preserve">). This confirms that the model did not introduce convoluted defensive branching, but also explains why the taint-tracking alerts persisted: no validation branches were added to intercept the untrusted dataflow.</w:t>
       </w:r>
     </w:p>
     <w:p>
@@ -3468,139 +3877,15 @@
         </w:pict>
       </w:r>
     </w:p>
-    <w:bookmarkEnd w:id="38"/>
     <w:bookmarkEnd w:id="39"/>
-    <w:bookmarkStart w:id="40" w:name="threats-to-validity-and-limitations"/>
+    <w:bookmarkEnd w:id="40"/>
+    <w:bookmarkStart w:id="41" w:name="threats-to-validity-and-limitations"/>
     <w:p>
       <w:pPr>
         <w:pStyle w:val="Heading2"/>
       </w:pPr>
       <w:r>
         <w:t xml:space="preserve">7. Threats to Validity and Limitations</w:t>
-      </w:r>
-    </w:p>
-    <w:p>
-      <w:pPr>
-        <w:pStyle w:val="Compact"/>
-        <w:numPr>
-          <w:ilvl w:val="0"/>
-          <w:numId w:val="1003"/>
-        </w:numPr>
-      </w:pPr>
-      <w:r>
-        <w:rPr>
-          <w:b/>
-          <w:bCs/>
-        </w:rPr>
-        <w:t xml:space="preserve">Static Analysis as a Proxy:</w:t>
-      </w:r>
-      <w:r>
-        <w:t xml:space="preserve"> </w:t>
-      </w:r>
-      <w:r>
-        <w:t xml:space="preserve">Static analysis alerts represent potential vulnerabilities rather than confirmed dynamic exploits. Some flagged patterns may be benign in contained environments.</w:t>
-      </w:r>
-    </w:p>
-    <w:p>
-      <w:pPr>
-        <w:pStyle w:val="Compact"/>
-        <w:numPr>
-          <w:ilvl w:val="0"/>
-          <w:numId w:val="1003"/>
-        </w:numPr>
-      </w:pPr>
-      <w:r>
-        <w:rPr>
-          <w:b/>
-          <w:bCs/>
-        </w:rPr>
-        <w:t xml:space="preserve">Sample Size:</w:t>
-      </w:r>
-      <w:r>
-        <w:t xml:space="preserve"> </w:t>
-      </w:r>
-      <w:r>
-        <w:t xml:space="preserve">While the local pipeline confirms end-to-end feasibility and precise metrics, the full 83-task Python dataset requires execution on cloud compute (e.g., Kaggle GPU) due to local CPU latency (~6 minutes per task). We provide the complete Kaggle notebook for full-scale replication.</w:t>
-      </w:r>
-    </w:p>
-    <w:p>
-      <w:pPr>
-        <w:pStyle w:val="Compact"/>
-        <w:numPr>
-          <w:ilvl w:val="0"/>
-          <w:numId w:val="1003"/>
-        </w:numPr>
-      </w:pPr>
-      <w:r>
-        <w:rPr>
-          <w:b/>
-          <w:bCs/>
-        </w:rPr>
-        <w:t xml:space="preserve">Absence of Functional Unit Tests:</w:t>
-      </w:r>
-      <w:r>
-        <w:t xml:space="preserve"> </w:t>
-      </w:r>
-      <w:r>
-        <w:t xml:space="preserve">We do not evaluate functional correctness beyond syntax validity. A model repair could theoretically suppress a warning by deleting functionality.</w:t>
-      </w:r>
-    </w:p>
-    <w:p>
-      <w:r>
-        <w:pict>
-          <v:rect style="width:0;height:1.5pt" o:hralign="center" o:hrstd="t" o:hr="t"/>
-        </w:pict>
-      </w:r>
-    </w:p>
-    <w:bookmarkEnd w:id="40"/>
-    <w:bookmarkStart w:id="41" w:name="conclusion-and-future-work"/>
-    <w:p>
-      <w:pPr>
-        <w:pStyle w:val="Heading2"/>
-      </w:pPr>
-      <w:r>
-        <w:t xml:space="preserve">8. Conclusion and Future Work</w:t>
-      </w:r>
-    </w:p>
-    <w:p>
-      <w:pPr>
-        <w:pStyle w:val="FirstParagraph"/>
-      </w:pPr>
-      <w:r>
-        <w:t xml:space="preserve">This study provides an empirical examination of scanner-guided AI code repair using CodeQL and LLMSecEval. Our results show that general security prompting is ineffective, and raw SAST feedback resolves configuration errors but leaves complex dataflow vulnerabilities largely untouched. Future work will investigate</w:t>
-      </w:r>
-      <w:r>
-        <w:t xml:space="preserve"> </w:t>
-      </w:r>
-      <w:r>
-        <w:rPr>
-          <w:b/>
-          <w:bCs/>
-        </w:rPr>
-        <w:t xml:space="preserve">few-shot AST-guided prompting</w:t>
-      </w:r>
-      <w:r>
-        <w:t xml:space="preserve"> </w:t>
-      </w:r>
-      <w:r>
-        <w:t xml:space="preserve">and multi-agent repair architectures where automated sanitizer templates are provided alongside static analysis diagnostics.</w:t>
-      </w:r>
-    </w:p>
-    <w:p>
-      <w:r>
-        <w:pict>
-          <v:rect style="width:0;height:1.5pt" o:hralign="center" o:hrstd="t" o:hr="t"/>
-        </w:pict>
-      </w:r>
-    </w:p>
-    <w:bookmarkEnd w:id="41"/>
-    <w:bookmarkStart w:id="44" w:name="references"/>
-    <w:p>
-      <w:pPr>
-        <w:pStyle w:val="Heading2"/>
-      </w:pPr>
-      <w:r>
-        <w:t xml:space="preserve">References</w:t>
       </w:r>
     </w:p>
     <w:p>
@@ -3612,20 +3897,17 @@
         </w:numPr>
       </w:pPr>
       <w:r>
-        <w:t xml:space="preserve">Pearce, H., Ahmad, B., Tan, B., Dolan-Gavitt, B., &amp; Karri, R. (2022). Asleep at the keyboard? Assessing the security of GitHub Copilot’s code contributions. In</w:t>
-      </w:r>
-      <w:r>
-        <w:t xml:space="preserve"> </w:t>
-      </w:r>
-      <w:r>
-        <w:rPr>
-          <w:i/>
-          <w:iCs/>
-        </w:rPr>
-        <w:t xml:space="preserve">2022 IEEE Symposium on Security and Privacy (SP)</w:t>
-      </w:r>
-      <w:r>
-        <w:t xml:space="preserve">, pp. 754-768.</w:t>
+        <w:rPr>
+          <w:b/>
+          <w:bCs/>
+        </w:rPr>
+        <w:t xml:space="preserve">Pilot Sample Size:</w:t>
+      </w:r>
+      <w:r>
+        <w:t xml:space="preserve"> </w:t>
+      </w:r>
+      <w:r>
+        <w:t xml:space="preserve">This study reports on an initial pilot of 3 Python tasks from the 83-task benchmark. The findings are hypothesis-generating and should not be generalized to all CWE categories or large-scale codebases without completing the full benchmark.</w:t>
       </w:r>
     </w:p>
     <w:p>
@@ -3637,20 +3919,29 @@
         </w:numPr>
       </w:pPr>
       <w:r>
-        <w:t xml:space="preserve">Tony, C., Mutas, M., Ferreyra, N. E., &amp; Scanagatta, R. (2023). LLMSecEval: A dataset of natural language prompts for security evaluations of large language models. In</w:t>
-      </w:r>
-      <w:r>
-        <w:t xml:space="preserve"> </w:t>
-      </w:r>
-      <w:r>
-        <w:rPr>
-          <w:i/>
-          <w:iCs/>
-        </w:rPr>
-        <w:t xml:space="preserve">Proceedings of the 20th International Conference on Mining Software Repositories (MSR)</w:t>
-      </w:r>
-      <w:r>
-        <w:t xml:space="preserve">, pp. 588-592.</w:t>
+        <w:rPr>
+          <w:b/>
+          <w:bCs/>
+        </w:rPr>
+        <w:t xml:space="preserve">Model Specificity:</w:t>
+      </w:r>
+      <w:r>
+        <w:t xml:space="preserve"> </w:t>
+      </w:r>
+      <w:r>
+        <w:t xml:space="preserve">Results reflect the capabilities of</w:t>
+      </w:r>
+      <w:r>
+        <w:t xml:space="preserve"> </w:t>
+      </w:r>
+      <w:r>
+        <w:rPr>
+          <w:rStyle w:val="VerbatimChar"/>
+        </w:rPr>
+        <w:t xml:space="preserve">Qwen2.5-Coder-1.5B-Instruct</w:t>
+      </w:r>
+      <w:r>
+        <w:t xml:space="preserve">. Larger frontier models (e.g., 7B, 32B, or proprietary models) may exhibit different repair dynamics.</w:t>
       </w:r>
     </w:p>
     <w:p>
@@ -3662,20 +3953,17 @@
         </w:numPr>
       </w:pPr>
       <w:r>
-        <w:t xml:space="preserve">Siddiq, M. L., &amp; Santos, J. C. (2022). SecurityEval: A benchmark of security-oriented code generation prompts. In</w:t>
-      </w:r>
-      <w:r>
-        <w:t xml:space="preserve"> </w:t>
-      </w:r>
-      <w:r>
-        <w:rPr>
-          <w:i/>
-          <w:iCs/>
-        </w:rPr>
-        <w:t xml:space="preserve">Proceedings of the 1st International Workshop on Mining Software Repositories for Software Security</w:t>
-      </w:r>
-      <w:r>
-        <w:t xml:space="preserve">, pp. 45-52.</w:t>
+        <w:rPr>
+          <w:b/>
+          <w:bCs/>
+        </w:rPr>
+        <w:t xml:space="preserve">Static Analysis as a Proxy:</w:t>
+      </w:r>
+      <w:r>
+        <w:t xml:space="preserve"> </w:t>
+      </w:r>
+      <w:r>
+        <w:t xml:space="preserve">CodeQL alerts indicate static pattern matches and dataflow paths, not confirmed dynamic exploitability.</w:t>
       </w:r>
     </w:p>
     <w:p>
@@ -3687,20 +3975,59 @@
         </w:numPr>
       </w:pPr>
       <w:r>
-        <w:t xml:space="preserve">Khoury, R., Anderson, A., &amp; O’Brien, L. (2023). How secure is AI-generated code? A study of ChatGPT’s security awareness.</w:t>
-      </w:r>
-      <w:r>
-        <w:t xml:space="preserve"> </w:t>
-      </w:r>
-      <w:r>
-        <w:rPr>
-          <w:i/>
-          <w:iCs/>
-        </w:rPr>
-        <w:t xml:space="preserve">IEEE Transactions on Reliability</w:t>
-      </w:r>
-      <w:r>
-        <w:t xml:space="preserve">, 73(1), pp. 210-222.</w:t>
+        <w:rPr>
+          <w:b/>
+          <w:bCs/>
+        </w:rPr>
+        <w:t xml:space="preserve">Absence of Functional Testing:</w:t>
+      </w:r>
+      <w:r>
+        <w:t xml:space="preserve"> </w:t>
+      </w:r>
+      <w:r>
+        <w:t xml:space="preserve">Functional unit tests were not executed; repairs could theoretically alter intended program semantics while suppressing warnings.</w:t>
+      </w:r>
+    </w:p>
+    <w:p>
+      <w:r>
+        <w:pict>
+          <v:rect style="width:0;height:1.5pt" o:hralign="center" o:hrstd="t" o:hr="t"/>
+        </w:pict>
+      </w:r>
+    </w:p>
+    <w:bookmarkEnd w:id="41"/>
+    <w:bookmarkStart w:id="42" w:name="conclusion-and-future-directions"/>
+    <w:p>
+      <w:pPr>
+        <w:pStyle w:val="Heading2"/>
+      </w:pPr>
+      <w:r>
+        <w:t xml:space="preserve">8. Conclusion and Future Directions</w:t>
+      </w:r>
+    </w:p>
+    <w:p>
+      <w:pPr>
+        <w:pStyle w:val="FirstParagraph"/>
+      </w:pPr>
+      <w:r>
+        <w:t xml:space="preserve">This preliminary study validates an automated evaluation framework for closed-loop AI code repair using CodeQL and LLMSecEval. Our pilot results indicate that general security prompt constraints are ineffective, and raw SAST feedback readily fixes trivial configuration flags but struggles with complex dataflow taint flows. Future work will deploy the validated Kaggle pipeline to scale across the complete 83-task benchmark, evaluate larger model architectures (7B and 32B), and explore multi-agent repair workflows incorporating structural sanitizer templates.</w:t>
+      </w:r>
+    </w:p>
+    <w:p>
+      <w:r>
+        <w:pict>
+          <v:rect style="width:0;height:1.5pt" o:hralign="center" o:hrstd="t" o:hr="t"/>
+        </w:pict>
+      </w:r>
+    </w:p>
+    <w:bookmarkEnd w:id="42"/>
+    <w:bookmarkStart w:id="49" w:name="references"/>
+    <w:p>
+      <w:pPr>
+        <w:pStyle w:val="Heading2"/>
+      </w:pPr>
+      <w:r>
+        <w:t xml:space="preserve">References</w:t>
       </w:r>
     </w:p>
     <w:p>
@@ -3708,16 +4035,160 @@
         <w:pStyle w:val="Compact"/>
         <w:numPr>
           <w:ilvl w:val="0"/>
-          <w:numId w:val="1004"/>
+          <w:numId w:val="1005"/>
         </w:numPr>
       </w:pPr>
       <w:r>
-        <w:t xml:space="preserve">GitHub. (2024). CodeQL documentation and CLI query suites.</w:t>
-      </w:r>
-      <w:r>
-        <w:t xml:space="preserve"> </w:t>
-      </w:r>
-      <w:hyperlink r:id="rId42">
+        <w:t xml:space="preserve">Pearce, H., Ahmad, B., Tan, B., Dolan-Gavitt, B., &amp; Karri, R. (2022). Asleep at the keyboard? Assessing the security of GitHub Copilot’s code contributions. In</w:t>
+      </w:r>
+      <w:r>
+        <w:t xml:space="preserve"> </w:t>
+      </w:r>
+      <w:r>
+        <w:rPr>
+          <w:i/>
+          <w:iCs/>
+        </w:rPr>
+        <w:t xml:space="preserve">2022 IEEE Symposium on Security and Privacy (SP)</w:t>
+      </w:r>
+      <w:r>
+        <w:t xml:space="preserve">, pp. 754-768. DOI:</w:t>
+      </w:r>
+      <w:r>
+        <w:t xml:space="preserve"> </w:t>
+      </w:r>
+      <w:hyperlink r:id="rId43">
+        <w:r>
+          <w:rPr>
+            <w:rStyle w:val="Hyperlink"/>
+          </w:rPr>
+          <w:t xml:space="preserve">10.1109/SP46214.2022.9833571</w:t>
+        </w:r>
+      </w:hyperlink>
+    </w:p>
+    <w:p>
+      <w:pPr>
+        <w:pStyle w:val="Compact"/>
+        <w:numPr>
+          <w:ilvl w:val="0"/>
+          <w:numId w:val="1005"/>
+        </w:numPr>
+      </w:pPr>
+      <w:r>
+        <w:t xml:space="preserve">Tony, C., Mutas, M., Ferreyra, N. E., &amp; Scanagatta, R. (2023). LLMSecEval: A dataset of natural language prompts for security evaluations of large language models. In</w:t>
+      </w:r>
+      <w:r>
+        <w:t xml:space="preserve"> </w:t>
+      </w:r>
+      <w:r>
+        <w:rPr>
+          <w:i/>
+          <w:iCs/>
+        </w:rPr>
+        <w:t xml:space="preserve">Proceedings of the 20th International Conference on Mining Software Repositories (MSR)</w:t>
+      </w:r>
+      <w:r>
+        <w:t xml:space="preserve">, pp. 588-592. DOI:</w:t>
+      </w:r>
+      <w:r>
+        <w:t xml:space="preserve"> </w:t>
+      </w:r>
+      <w:hyperlink r:id="rId44">
+        <w:r>
+          <w:rPr>
+            <w:rStyle w:val="Hyperlink"/>
+          </w:rPr>
+          <w:t xml:space="preserve">10.1109/MSR59073.2023.00084</w:t>
+        </w:r>
+      </w:hyperlink>
+    </w:p>
+    <w:p>
+      <w:pPr>
+        <w:pStyle w:val="Compact"/>
+        <w:numPr>
+          <w:ilvl w:val="0"/>
+          <w:numId w:val="1005"/>
+        </w:numPr>
+      </w:pPr>
+      <w:r>
+        <w:t xml:space="preserve">Siddiq, M. L., &amp; Santos, J. C. (2022). SecurityEval: A benchmark of security-oriented code generation prompts. In</w:t>
+      </w:r>
+      <w:r>
+        <w:t xml:space="preserve"> </w:t>
+      </w:r>
+      <w:r>
+        <w:rPr>
+          <w:i/>
+          <w:iCs/>
+        </w:rPr>
+        <w:t xml:space="preserve">Proceedings of the 1st International Workshop on Mining Software Repositories for Software Security (MSR4P&amp;S)</w:t>
+      </w:r>
+      <w:r>
+        <w:t xml:space="preserve">, pp. 45-52. DOI:</w:t>
+      </w:r>
+      <w:r>
+        <w:t xml:space="preserve"> </w:t>
+      </w:r>
+      <w:hyperlink r:id="rId45">
+        <w:r>
+          <w:rPr>
+            <w:rStyle w:val="Hyperlink"/>
+          </w:rPr>
+          <w:t xml:space="preserve">10.1145/3549035.3561184</w:t>
+        </w:r>
+      </w:hyperlink>
+    </w:p>
+    <w:p>
+      <w:pPr>
+        <w:pStyle w:val="Compact"/>
+        <w:numPr>
+          <w:ilvl w:val="0"/>
+          <w:numId w:val="1005"/>
+        </w:numPr>
+      </w:pPr>
+      <w:r>
+        <w:t xml:space="preserve">Khoury, R., Anderson, A., &amp; O’Brien, L. (2023). How secure is AI-generated code? A study of ChatGPT’s security awareness.</w:t>
+      </w:r>
+      <w:r>
+        <w:t xml:space="preserve"> </w:t>
+      </w:r>
+      <w:r>
+        <w:rPr>
+          <w:i/>
+          <w:iCs/>
+        </w:rPr>
+        <w:t xml:space="preserve">IEEE Transactions on Reliability</w:t>
+      </w:r>
+      <w:r>
+        <w:t xml:space="preserve">, 73(1), pp. 210-222. DOI:</w:t>
+      </w:r>
+      <w:r>
+        <w:t xml:space="preserve"> </w:t>
+      </w:r>
+      <w:hyperlink r:id="rId46">
+        <w:r>
+          <w:rPr>
+            <w:rStyle w:val="Hyperlink"/>
+          </w:rPr>
+          <w:t xml:space="preserve">10.1109/TR.2023.3333838</w:t>
+        </w:r>
+      </w:hyperlink>
+    </w:p>
+    <w:p>
+      <w:pPr>
+        <w:pStyle w:val="Compact"/>
+        <w:numPr>
+          <w:ilvl w:val="0"/>
+          <w:numId w:val="1005"/>
+        </w:numPr>
+      </w:pPr>
+      <w:r>
+        <w:t xml:space="preserve">GitHub. (2024). CodeQL CLI and standard query suites documentation. Available:</w:t>
+      </w:r>
+      <w:r>
+        <w:t xml:space="preserve"> </w:t>
+      </w:r>
+      <w:hyperlink r:id="rId47">
         <w:r>
           <w:rPr>
             <w:rStyle w:val="Hyperlink"/>
@@ -3731,16 +4202,16 @@
         <w:pStyle w:val="Compact"/>
         <w:numPr>
           <w:ilvl w:val="0"/>
-          <w:numId w:val="1004"/>
+          <w:numId w:val="1005"/>
         </w:numPr>
       </w:pPr>
       <w:r>
-        <w:t xml:space="preserve">Radon Documentation. (2023). Radon: Code metrics in Python.</w:t>
-      </w:r>
-      <w:r>
-        <w:t xml:space="preserve"> </w:t>
-      </w:r>
-      <w:hyperlink r:id="rId43">
+        <w:t xml:space="preserve">Radon Documentation. (2023). Radon: Code metrics in Python. Available:</w:t>
+      </w:r>
+      <w:r>
+        <w:t xml:space="preserve"> </w:t>
+      </w:r>
+      <w:hyperlink r:id="rId48">
         <w:r>
           <w:rPr>
             <w:rStyle w:val="Hyperlink"/>
@@ -3749,8 +4220,8 @@
         </w:r>
       </w:hyperlink>
     </w:p>
-    <w:bookmarkEnd w:id="44"/>
-    <w:bookmarkEnd w:id="45"/>
+    <w:bookmarkEnd w:id="49"/>
+    <w:bookmarkEnd w:id="50"/>
     <w:sectPr>
       <w:footnotePr>
         <w:numRestart w:val="eachSect"/>
@@ -4059,6 +4530,9 @@
     <w:abstractNumId w:val="991"/>
   </w:num>
   <w:num w:numId="1003">
+    <w:abstractNumId w:val="991"/>
+  </w:num>
+  <w:num w:numId="1004">
     <w:abstractNumId w:val="99411"/>
     <w:lvlOverride w:ilvl="0">
       <w:startOverride w:val="1"/>
@@ -4088,7 +4562,7 @@
       <w:startOverride w:val="1"/>
     </w:lvlOverride>
   </w:num>
-  <w:num w:numId="1004">
+  <w:num w:numId="1005">
     <w:abstractNumId w:val="99411"/>
     <w:lvlOverride w:ilvl="0">
       <w:startOverride w:val="1"/>

</xml_diff>

<commit_message>
fix(pdf): restore missing abstract values, include Figure 3, add running headers and footers
</commit_message>
<xml_diff>
--- a/paper/research_paper.docx
+++ b/paper/research_paper.docx
@@ -203,123 +203,19 @@
         <w:t xml:space="preserve">(C) Closed-loop scanner-guided repair</w:t>
       </w:r>
       <w:r>
-        <w:t xml:space="preserve">. Before experimental execution, we validate the CodeQL harness against ground-truth positive (Flask untrusted redirect in debug mode) and negative controls, confirming identical detection across CSV and SARIF outputs. In an initial three-task pilot evaluation (</w:t>
-      </w:r>
-      <m:oMath>
-        <m:r>
-          <m:t>N</m:t>
-        </m:r>
-        <m:r>
-          <m:rPr>
-            <m:sty m:val="p"/>
-          </m:rPr>
-          <m:t>=</m:t>
-        </m:r>
-        <m:r>
-          <m:t>3</m:t>
-        </m:r>
-      </m:oMath>
-      <w:r>
-        <w:t xml:space="preserve"> </w:t>
-      </w:r>
-      <w:r>
-        <w:t xml:space="preserve">Python tasks from LLMSecEval), we observe that: (1) security-aware prompting was completely ineffective at suppressing baseline alerts (100% alert persistence across all 4 baseline alert instances); (2) scanner-guided repair resolved a localized configuration flaw (</w:t>
-      </w:r>
-      <w:r>
-        <w:rPr>
-          <w:rStyle w:val="VerbatimChar"/>
-        </w:rPr>
-        <w:t xml:space="preserve">Flask app is run in debug mode</w:t>
+        <w:t xml:space="preserve">. Before experimental execution, we validate the CodeQL harness against ground-truth positive (Flask untrusted redirect in debug mode) and negative controls, confirming identical detection across CSV and SARIF outputs. In an initial three-task pilot evaluation (sample size N = 3 Python tasks from LLMSecEval), we observe that: (1) security-aware prompting was completely ineffective at suppressing baseline alerts (100% alert persistence across all 4 baseline alert instances); (2) scanner-guided repair resolved a localized configuration flaw (</w:t>
+      </w:r>
+      <w:r>
+        <w:t xml:space="preserve">“Flask app is run in debug mode”</w:t>
       </w:r>
       <w:r>
         <w:t xml:space="preserve">, 1/4 alerts, 25.0% resolution rate), but failed to eliminate dataflow taint-tracking alerts (</w:t>
       </w:r>
       <w:r>
-        <w:rPr>
-          <w:rStyle w:val="VerbatimChar"/>
-        </w:rPr>
-        <w:t xml:space="preserve">URL redirection from remote source</w:t>
-      </w:r>
-      <w:r>
-        <w:t xml:space="preserve">, 3/4 alerts, 75.0% persistence rate); (3) no new secondary findings were introduced in evaluable cases (</w:t>
-      </w:r>
-      <m:oMath>
-        <m:r>
-          <m:rPr>
-            <m:nor/>
-            <m:sty m:val="p"/>
-          </m:rPr>
-          <m:t>New</m:t>
-        </m:r>
-        <m:r>
-          <m:rPr>
-            <m:sty m:val="p"/>
-          </m:rPr>
-          <m:t>=</m:t>
-        </m:r>
-        <m:r>
-          <m:t>0</m:t>
-        </m:r>
-      </m:oMath>
-      <w:r>
-        <w:t xml:space="preserve">); and (4) Radon cyclomatic complexity and logical lines of code remained unchanged across repairs (</w:t>
-      </w:r>
-      <m:oMath>
-        <m:r>
-          <m:rPr>
-            <m:sty m:val="p"/>
-          </m:rPr>
-          <m:t>Δ</m:t>
-        </m:r>
-        <m:r>
-          <m:rPr>
-            <m:nor/>
-            <m:sty m:val="p"/>
-          </m:rPr>
-          <m:t>CC</m:t>
-        </m:r>
-        <m:r>
-          <m:rPr>
-            <m:sty m:val="p"/>
-          </m:rPr>
-          <m:t>=</m:t>
-        </m:r>
-        <m:r>
-          <m:t>0</m:t>
-        </m:r>
-      </m:oMath>
-      <w:r>
-        <w:t xml:space="preserve">,</w:t>
-      </w:r>
-      <w:r>
-        <w:t xml:space="preserve"> </w:t>
-      </w:r>
-      <m:oMath>
-        <m:r>
-          <m:rPr>
-            <m:sty m:val="p"/>
-          </m:rPr>
-          <m:t>Δ</m:t>
-        </m:r>
-        <m:r>
-          <m:rPr>
-            <m:nor/>
-            <m:sty m:val="p"/>
-          </m:rPr>
-          <m:t>LOC</m:t>
-        </m:r>
-        <m:r>
-          <m:rPr>
-            <m:sty m:val="p"/>
-          </m:rPr>
-          <m:t>=</m:t>
-        </m:r>
-        <m:r>
-          <m:t>0</m:t>
-        </m:r>
-      </m:oMath>
-      <w:r>
-        <w:t xml:space="preserve">). While constrained by a pilot sample size, these preliminary findings suggest that naive diagnostic feedback enables models to patch literal configuration flags but fails to prompt architectural sanitization for dataflow vulnerabilities, highlighting the need for structured template guidance in automated AI program repair.</w:t>
+        <w:t xml:space="preserve">“URL redirection from remote source”</w:t>
+      </w:r>
+      <w:r>
+        <w:t xml:space="preserve">, 3/4 alerts, 75.0% persistence rate); (3) no new secondary findings were introduced in evaluable cases (New = 0 alert instances); and (4) Radon cyclomatic complexity and logical lines of code remained unchanged across repairs (change in CC = 0, change in LOC = 0; mean CC = 1.33, mean LOC = 11.0). While constrained by a pilot sample size, these preliminary findings suggest that naive diagnostic feedback enables models to patch literal configuration flags but fails to prompt architectural sanitization for dataflow vulnerabilities, highlighting the need for structured template guidance in automated AI program repair.</w:t>
       </w:r>
     </w:p>
     <w:p>

</xml_diff>